<commit_message>
feat: Implement Cloud Sync Phase 2 (Database & Async Storage)
</commit_message>
<xml_diff>
--- a/prd/product_requirements_document.docx
+++ b/prd/product_requirements_document.docx
@@ -61,10 +61,91 @@
           <w:lang w:eastAsia="en-GB"/>
           <w14:ligatures w14:val="none"/>
         </w:rPr>
-        <w:t>Project Name: "</w:t>
-      </w:r>
-      <w:proofErr w:type="spellStart"/>
-      <w:r>
+        <w:t>Project Name: "FretGym" (Working Title)</w:t>
+      </w:r>
+    </w:p>
+    <w:p>
+      <w:pPr>
+        <w:spacing w:before="100" w:beforeAutospacing="1" w:after="100" w:afterAutospacing="1"/>
+        <w:rPr>
+          <w:rFonts w:ascii="Times New Roman" w:eastAsia="Times New Roman" w:hAnsi="Times New Roman" w:cs="Times New Roman"/>
+          <w:color w:val="000000"/>
+          <w:kern w:val="0"/>
+          <w:lang w:eastAsia="en-GB"/>
+          <w14:ligatures w14:val="none"/>
+        </w:rPr>
+      </w:pPr>
+      <w:r>
+        <w:rPr>
+          <w:rFonts w:ascii="Times New Roman" w:eastAsia="Times New Roman" w:hAnsi="Times New Roman" w:cs="Times New Roman"/>
+          <w:b/>
+          <w:bCs/>
+          <w:color w:val="000000"/>
+          <w:kern w:val="0"/>
+          <w:lang w:eastAsia="en-GB"/>
+          <w14:ligatures w14:val="none"/>
+        </w:rPr>
+        <w:t>Version:</w:t>
+      </w:r>
+      <w:r>
+        <w:rPr>
+          <w:rFonts w:ascii="Times New Roman" w:eastAsia="Times New Roman" w:hAnsi="Times New Roman" w:cs="Times New Roman"/>
+          <w:color w:val="000000"/>
+          <w:kern w:val="0"/>
+          <w:lang w:eastAsia="en-GB"/>
+          <w14:ligatures w14:val="none"/>
+        </w:rPr>
+        <w:t> 1.1 </w:t>
+      </w:r>
+      <w:r>
+        <w:rPr>
+          <w:rFonts w:ascii="Times New Roman" w:eastAsia="Times New Roman" w:hAnsi="Times New Roman" w:cs="Times New Roman"/>
+          <w:b/>
+          <w:bCs/>
+          <w:color w:val="000000"/>
+          <w:kern w:val="0"/>
+          <w:lang w:eastAsia="en-GB"/>
+          <w14:ligatures w14:val="none"/>
+        </w:rPr>
+        <w:t>Status:</w:t>
+      </w:r>
+      <w:r>
+        <w:rPr>
+          <w:rFonts w:ascii="Times New Roman" w:eastAsia="Times New Roman" w:hAnsi="Times New Roman" w:cs="Times New Roman"/>
+          <w:color w:val="000000"/>
+          <w:kern w:val="0"/>
+          <w:lang w:eastAsia="en-GB"/>
+          <w14:ligatures w14:val="none"/>
+        </w:rPr>
+        <w:t> Draft </w:t>
+      </w:r>
+      <w:r>
+        <w:rPr>
+          <w:rFonts w:ascii="Times New Roman" w:eastAsia="Times New Roman" w:hAnsi="Times New Roman" w:cs="Times New Roman"/>
+          <w:b/>
+          <w:bCs/>
+          <w:color w:val="000000"/>
+          <w:kern w:val="0"/>
+          <w:lang w:eastAsia="en-GB"/>
+          <w14:ligatures w14:val="none"/>
+        </w:rPr>
+        <w:t>Date:</w:t>
+      </w:r>
+      <w:r>
+        <w:rPr>
+          <w:rFonts w:ascii="Times New Roman" w:eastAsia="Times New Roman" w:hAnsi="Times New Roman" w:cs="Times New Roman"/>
+          <w:color w:val="000000"/>
+          <w:kern w:val="0"/>
+          <w:lang w:eastAsia="en-GB"/>
+          <w14:ligatures w14:val="none"/>
+        </w:rPr>
+        <w:t> November 22, 2025</w:t>
+      </w:r>
+    </w:p>
+    <w:p>
+      <w:pPr>
+        <w:spacing w:before="100" w:beforeAutospacing="1" w:after="100" w:afterAutospacing="1"/>
+        <w:outlineLvl w:val="1"/>
         <w:rPr>
           <w:rFonts w:ascii="Times New Roman" w:eastAsia="Times New Roman" w:hAnsi="Times New Roman" w:cs="Times New Roman"/>
           <w:b/>
@@ -76,9 +157,7 @@
           <w:lang w:eastAsia="en-GB"/>
           <w14:ligatures w14:val="none"/>
         </w:rPr>
-        <w:t>FretGym</w:t>
-      </w:r>
-      <w:proofErr w:type="spellEnd"/>
+      </w:pPr>
       <w:r>
         <w:rPr>
           <w:rFonts w:ascii="Times New Roman" w:eastAsia="Times New Roman" w:hAnsi="Times New Roman" w:cs="Times New Roman"/>
@@ -91,85 +170,107 @@
           <w:lang w:eastAsia="en-GB"/>
           <w14:ligatures w14:val="none"/>
         </w:rPr>
-        <w:t>" (Working Title)</w:t>
-      </w:r>
-    </w:p>
-    <w:p>
-      <w:pPr>
-        <w:spacing w:before="100" w:beforeAutospacing="1" w:after="100" w:afterAutospacing="1"/>
-        <w:rPr>
-          <w:rFonts w:ascii="Times New Roman" w:eastAsia="Times New Roman" w:hAnsi="Times New Roman" w:cs="Times New Roman"/>
-          <w:color w:val="000000"/>
-          <w:kern w:val="0"/>
-          <w:lang w:eastAsia="en-GB"/>
-          <w14:ligatures w14:val="none"/>
-        </w:rPr>
-      </w:pPr>
-      <w:r>
-        <w:rPr>
-          <w:rFonts w:ascii="Times New Roman" w:eastAsia="Times New Roman" w:hAnsi="Times New Roman" w:cs="Times New Roman"/>
-          <w:b/>
-          <w:bCs/>
-          <w:color w:val="000000"/>
-          <w:kern w:val="0"/>
-          <w:lang w:eastAsia="en-GB"/>
-          <w14:ligatures w14:val="none"/>
-        </w:rPr>
-        <w:t>Version:</w:t>
-      </w:r>
-      <w:r>
-        <w:rPr>
-          <w:rFonts w:ascii="Times New Roman" w:eastAsia="Times New Roman" w:hAnsi="Times New Roman" w:cs="Times New Roman"/>
-          <w:color w:val="000000"/>
-          <w:kern w:val="0"/>
-          <w:lang w:eastAsia="en-GB"/>
-          <w14:ligatures w14:val="none"/>
-        </w:rPr>
-        <w:t> 1.0 </w:t>
-      </w:r>
-      <w:r>
-        <w:rPr>
-          <w:rFonts w:ascii="Times New Roman" w:eastAsia="Times New Roman" w:hAnsi="Times New Roman" w:cs="Times New Roman"/>
-          <w:b/>
-          <w:bCs/>
-          <w:color w:val="000000"/>
-          <w:kern w:val="0"/>
-          <w:lang w:eastAsia="en-GB"/>
-          <w14:ligatures w14:val="none"/>
-        </w:rPr>
-        <w:t>Status:</w:t>
-      </w:r>
-      <w:r>
-        <w:rPr>
-          <w:rFonts w:ascii="Times New Roman" w:eastAsia="Times New Roman" w:hAnsi="Times New Roman" w:cs="Times New Roman"/>
-          <w:color w:val="000000"/>
-          <w:kern w:val="0"/>
-          <w:lang w:eastAsia="en-GB"/>
-          <w14:ligatures w14:val="none"/>
-        </w:rPr>
-        <w:t> Draft </w:t>
-      </w:r>
-      <w:r>
-        <w:rPr>
-          <w:rFonts w:ascii="Times New Roman" w:eastAsia="Times New Roman" w:hAnsi="Times New Roman" w:cs="Times New Roman"/>
-          <w:b/>
-          <w:bCs/>
-          <w:color w:val="000000"/>
-          <w:kern w:val="0"/>
-          <w:lang w:eastAsia="en-GB"/>
-          <w14:ligatures w14:val="none"/>
-        </w:rPr>
-        <w:t>Date:</w:t>
-      </w:r>
-      <w:r>
-        <w:rPr>
-          <w:rFonts w:ascii="Times New Roman" w:eastAsia="Times New Roman" w:hAnsi="Times New Roman" w:cs="Times New Roman"/>
-          <w:color w:val="000000"/>
-          <w:kern w:val="0"/>
-          <w:lang w:eastAsia="en-GB"/>
-          <w14:ligatures w14:val="none"/>
-        </w:rPr>
-        <w:t> November 22, 2025</w:t>
+        <w:t>1. Executive Summary</w:t>
+      </w:r>
+    </w:p>
+    <w:p>
+      <w:pPr>
+        <w:spacing w:before="100" w:beforeAutospacing="1" w:after="100" w:afterAutospacing="1"/>
+        <w:rPr>
+          <w:rFonts w:ascii="Times New Roman" w:eastAsia="Times New Roman" w:hAnsi="Times New Roman" w:cs="Times New Roman"/>
+          <w:color w:val="000000"/>
+          <w:kern w:val="0"/>
+          <w:lang w:eastAsia="en-GB"/>
+          <w14:ligatures w14:val="none"/>
+        </w:rPr>
+      </w:pPr>
+      <w:r>
+        <w:rPr>
+          <w:rFonts w:ascii="Times New Roman" w:eastAsia="Times New Roman" w:hAnsi="Times New Roman" w:cs="Times New Roman"/>
+          <w:b/>
+          <w:bCs/>
+          <w:color w:val="000000"/>
+          <w:kern w:val="0"/>
+          <w:lang w:eastAsia="en-GB"/>
+          <w14:ligatures w14:val="none"/>
+        </w:rPr>
+        <w:t>The Concept:</w:t>
+      </w:r>
+      <w:r>
+        <w:rPr>
+          <w:rFonts w:ascii="Times New Roman" w:eastAsia="Times New Roman" w:hAnsi="Times New Roman" w:cs="Times New Roman"/>
+          <w:color w:val="000000"/>
+          <w:kern w:val="0"/>
+          <w:lang w:eastAsia="en-GB"/>
+          <w14:ligatures w14:val="none"/>
+        </w:rPr>
+        <w:t> An iOS/Android mobile application that functions as a "Personal Trainer" for guitarists. unlike traditional learning apps that provide content (lessons/tabs), this app provides </w:t>
+      </w:r>
+      <w:r>
+        <w:rPr>
+          <w:rFonts w:ascii="Times New Roman" w:eastAsia="Times New Roman" w:hAnsi="Times New Roman" w:cs="Times New Roman"/>
+          <w:b/>
+          <w:bCs/>
+          <w:color w:val="000000"/>
+          <w:kern w:val="0"/>
+          <w:lang w:eastAsia="en-GB"/>
+          <w14:ligatures w14:val="none"/>
+        </w:rPr>
+        <w:t>structure, tracking, and management</w:t>
+      </w:r>
+      <w:r>
+        <w:rPr>
+          <w:rFonts w:ascii="Times New Roman" w:eastAsia="Times New Roman" w:hAnsi="Times New Roman" w:cs="Times New Roman"/>
+          <w:color w:val="000000"/>
+          <w:kern w:val="0"/>
+          <w:lang w:eastAsia="en-GB"/>
+          <w14:ligatures w14:val="none"/>
+        </w:rPr>
+        <w:t> for content the user already owns. </w:t>
+      </w:r>
+      <w:r>
+        <w:rPr>
+          <w:rFonts w:ascii="Times New Roman" w:eastAsia="Times New Roman" w:hAnsi="Times New Roman" w:cs="Times New Roman"/>
+          <w:b/>
+          <w:bCs/>
+          <w:color w:val="000000"/>
+          <w:kern w:val="0"/>
+          <w:lang w:eastAsia="en-GB"/>
+          <w14:ligatures w14:val="none"/>
+        </w:rPr>
+        <w:t>The Problem:</w:t>
+      </w:r>
+      <w:r>
+        <w:rPr>
+          <w:rFonts w:ascii="Times New Roman" w:eastAsia="Times New Roman" w:hAnsi="Times New Roman" w:cs="Times New Roman"/>
+          <w:color w:val="000000"/>
+          <w:kern w:val="0"/>
+          <w:lang w:eastAsia="en-GB"/>
+          <w14:ligatures w14:val="none"/>
+        </w:rPr>
+        <w:t> Intermediate and advanced guitarists suffer from "noodling" (aimless playing). They lack structured practice routines and quantifiable metrics for improvement. </w:t>
+      </w:r>
+      <w:r>
+        <w:rPr>
+          <w:rFonts w:ascii="Times New Roman" w:eastAsia="Times New Roman" w:hAnsi="Times New Roman" w:cs="Times New Roman"/>
+          <w:b/>
+          <w:bCs/>
+          <w:color w:val="000000"/>
+          <w:kern w:val="0"/>
+          <w:lang w:eastAsia="en-GB"/>
+          <w14:ligatures w14:val="none"/>
+        </w:rPr>
+        <w:t>The Solution:</w:t>
+      </w:r>
+      <w:r>
+        <w:rPr>
+          <w:rFonts w:ascii="Times New Roman" w:eastAsia="Times New Roman" w:hAnsi="Times New Roman" w:cs="Times New Roman"/>
+          <w:color w:val="000000"/>
+          <w:kern w:val="0"/>
+          <w:lang w:eastAsia="en-GB"/>
+          <w14:ligatures w14:val="none"/>
+        </w:rPr>
+        <w:t> A "Quantified Self" app for musicians that tracks BPM (Speed), Repetitions (Volume), and Repertoire Health (Retention), utilizing "Progressive Overload" principles borrowed from weightlifting.</w:t>
       </w:r>
     </w:p>
     <w:p>
@@ -200,137 +301,6 @@
           <w:lang w:eastAsia="en-GB"/>
           <w14:ligatures w14:val="none"/>
         </w:rPr>
-        <w:t>1. Executive Summary</w:t>
-      </w:r>
-    </w:p>
-    <w:p>
-      <w:pPr>
-        <w:spacing w:before="100" w:beforeAutospacing="1" w:after="100" w:afterAutospacing="1"/>
-        <w:rPr>
-          <w:rFonts w:ascii="Times New Roman" w:eastAsia="Times New Roman" w:hAnsi="Times New Roman" w:cs="Times New Roman"/>
-          <w:color w:val="000000"/>
-          <w:kern w:val="0"/>
-          <w:lang w:eastAsia="en-GB"/>
-          <w14:ligatures w14:val="none"/>
-        </w:rPr>
-      </w:pPr>
-      <w:r>
-        <w:rPr>
-          <w:rFonts w:ascii="Times New Roman" w:eastAsia="Times New Roman" w:hAnsi="Times New Roman" w:cs="Times New Roman"/>
-          <w:b/>
-          <w:bCs/>
-          <w:color w:val="000000"/>
-          <w:kern w:val="0"/>
-          <w:lang w:eastAsia="en-GB"/>
-          <w14:ligatures w14:val="none"/>
-        </w:rPr>
-        <w:t>The Concept:</w:t>
-      </w:r>
-      <w:r>
-        <w:rPr>
-          <w:rFonts w:ascii="Times New Roman" w:eastAsia="Times New Roman" w:hAnsi="Times New Roman" w:cs="Times New Roman"/>
-          <w:color w:val="000000"/>
-          <w:kern w:val="0"/>
-          <w:lang w:eastAsia="en-GB"/>
-          <w14:ligatures w14:val="none"/>
-        </w:rPr>
-        <w:t> An iOS/Android mobile application that functions as a "Personal Trainer" for guitarists. unlike traditional learning apps that provide content (lessons/tabs), this app provides </w:t>
-      </w:r>
-      <w:r>
-        <w:rPr>
-          <w:rFonts w:ascii="Times New Roman" w:eastAsia="Times New Roman" w:hAnsi="Times New Roman" w:cs="Times New Roman"/>
-          <w:b/>
-          <w:bCs/>
-          <w:color w:val="000000"/>
-          <w:kern w:val="0"/>
-          <w:lang w:eastAsia="en-GB"/>
-          <w14:ligatures w14:val="none"/>
-        </w:rPr>
-        <w:t>structure, tracking, and management</w:t>
-      </w:r>
-      <w:r>
-        <w:rPr>
-          <w:rFonts w:ascii="Times New Roman" w:eastAsia="Times New Roman" w:hAnsi="Times New Roman" w:cs="Times New Roman"/>
-          <w:color w:val="000000"/>
-          <w:kern w:val="0"/>
-          <w:lang w:eastAsia="en-GB"/>
-          <w14:ligatures w14:val="none"/>
-        </w:rPr>
-        <w:t> for content the user already owns. </w:t>
-      </w:r>
-      <w:r>
-        <w:rPr>
-          <w:rFonts w:ascii="Times New Roman" w:eastAsia="Times New Roman" w:hAnsi="Times New Roman" w:cs="Times New Roman"/>
-          <w:b/>
-          <w:bCs/>
-          <w:color w:val="000000"/>
-          <w:kern w:val="0"/>
-          <w:lang w:eastAsia="en-GB"/>
-          <w14:ligatures w14:val="none"/>
-        </w:rPr>
-        <w:t>The Problem:</w:t>
-      </w:r>
-      <w:r>
-        <w:rPr>
-          <w:rFonts w:ascii="Times New Roman" w:eastAsia="Times New Roman" w:hAnsi="Times New Roman" w:cs="Times New Roman"/>
-          <w:color w:val="000000"/>
-          <w:kern w:val="0"/>
-          <w:lang w:eastAsia="en-GB"/>
-          <w14:ligatures w14:val="none"/>
-        </w:rPr>
-        <w:t> Intermediate and advanced guitarists suffer from "noodling" (aimless playing). They lack structured practice routines and quantifiable metrics for improvement. </w:t>
-      </w:r>
-      <w:r>
-        <w:rPr>
-          <w:rFonts w:ascii="Times New Roman" w:eastAsia="Times New Roman" w:hAnsi="Times New Roman" w:cs="Times New Roman"/>
-          <w:b/>
-          <w:bCs/>
-          <w:color w:val="000000"/>
-          <w:kern w:val="0"/>
-          <w:lang w:eastAsia="en-GB"/>
-          <w14:ligatures w14:val="none"/>
-        </w:rPr>
-        <w:t>The Solution:</w:t>
-      </w:r>
-      <w:r>
-        <w:rPr>
-          <w:rFonts w:ascii="Times New Roman" w:eastAsia="Times New Roman" w:hAnsi="Times New Roman" w:cs="Times New Roman"/>
-          <w:color w:val="000000"/>
-          <w:kern w:val="0"/>
-          <w:lang w:eastAsia="en-GB"/>
-          <w14:ligatures w14:val="none"/>
-        </w:rPr>
-        <w:t> A "Quantified Self" app for musicians that tracks BPM (Speed), Repetitions (Volume), and Repertoire Health (Retention), utilizing "Progressive Overload" principles borrowed from weightlifting.</w:t>
-      </w:r>
-    </w:p>
-    <w:p>
-      <w:pPr>
-        <w:spacing w:before="100" w:beforeAutospacing="1" w:after="100" w:afterAutospacing="1"/>
-        <w:outlineLvl w:val="1"/>
-        <w:rPr>
-          <w:rFonts w:ascii="Times New Roman" w:eastAsia="Times New Roman" w:hAnsi="Times New Roman" w:cs="Times New Roman"/>
-          <w:b/>
-          <w:bCs/>
-          <w:color w:val="000000"/>
-          <w:kern w:val="0"/>
-          <w:sz w:val="36"/>
-          <w:szCs w:val="36"/>
-          <w:lang w:eastAsia="en-GB"/>
-          <w14:ligatures w14:val="none"/>
-        </w:rPr>
-      </w:pPr>
-      <w:r>
-        <w:rPr>
-          <w:rFonts w:ascii="Times New Roman" w:eastAsia="Times New Roman" w:hAnsi="Times New Roman" w:cs="Times New Roman"/>
-          <w:b/>
-          <w:bCs/>
-          <w:color w:val="000000"/>
-          <w:kern w:val="0"/>
-          <w:sz w:val="36"/>
-          <w:szCs w:val="36"/>
-          <w:lang w:eastAsia="en-GB"/>
-          <w14:ligatures w14:val="none"/>
-        </w:rPr>
         <w:t>2. User Personas</w:t>
       </w:r>
     </w:p>
@@ -369,7 +339,7 @@
       <w:pPr>
         <w:numPr>
           <w:ilvl w:val="0"/>
-          <w:numId w:val="1"/>
+          <w:numId w:val="13"/>
         </w:numPr>
         <w:spacing w:before="100" w:beforeAutospacing="1" w:after="100" w:afterAutospacing="1"/>
         <w:rPr>
@@ -407,7 +377,7 @@
       <w:pPr>
         <w:numPr>
           <w:ilvl w:val="0"/>
-          <w:numId w:val="1"/>
+          <w:numId w:val="13"/>
         </w:numPr>
         <w:spacing w:before="100" w:beforeAutospacing="1" w:after="100" w:afterAutospacing="1"/>
         <w:rPr>
@@ -445,7 +415,7 @@
       <w:pPr>
         <w:numPr>
           <w:ilvl w:val="0"/>
-          <w:numId w:val="1"/>
+          <w:numId w:val="13"/>
         </w:numPr>
         <w:spacing w:before="100" w:beforeAutospacing="1" w:after="100" w:afterAutospacing="1"/>
         <w:rPr>
@@ -483,7 +453,7 @@
       <w:pPr>
         <w:numPr>
           <w:ilvl w:val="0"/>
-          <w:numId w:val="1"/>
+          <w:numId w:val="13"/>
         </w:numPr>
         <w:spacing w:before="100" w:beforeAutospacing="1" w:after="100" w:afterAutospacing="1"/>
         <w:rPr>
@@ -494,31 +464,17 @@
           <w14:ligatures w14:val="none"/>
         </w:rPr>
       </w:pPr>
-      <w:proofErr w:type="spellStart"/>
-      <w:r>
-        <w:rPr>
-          <w:rFonts w:ascii="Times New Roman" w:eastAsia="Times New Roman" w:hAnsi="Times New Roman" w:cs="Times New Roman"/>
-          <w:b/>
-          <w:bCs/>
-          <w:color w:val="000000"/>
-          <w:kern w:val="0"/>
-          <w:lang w:eastAsia="en-GB"/>
-          <w14:ligatures w14:val="none"/>
-        </w:rPr>
-        <w:t>Behavior</w:t>
-      </w:r>
-      <w:proofErr w:type="spellEnd"/>
-      <w:r>
-        <w:rPr>
-          <w:rFonts w:ascii="Times New Roman" w:eastAsia="Times New Roman" w:hAnsi="Times New Roman" w:cs="Times New Roman"/>
-          <w:b/>
-          <w:bCs/>
-          <w:color w:val="000000"/>
-          <w:kern w:val="0"/>
-          <w:lang w:eastAsia="en-GB"/>
-          <w14:ligatures w14:val="none"/>
-        </w:rPr>
-        <w:t>:</w:t>
+      <w:r>
+        <w:rPr>
+          <w:rFonts w:ascii="Times New Roman" w:eastAsia="Times New Roman" w:hAnsi="Times New Roman" w:cs="Times New Roman"/>
+          <w:b/>
+          <w:bCs/>
+          <w:color w:val="000000"/>
+          <w:kern w:val="0"/>
+          <w:lang w:eastAsia="en-GB"/>
+          <w14:ligatures w14:val="none"/>
+        </w:rPr>
+        <w:t>Behavior:</w:t>
       </w:r>
       <w:r>
         <w:rPr>
@@ -566,7 +522,7 @@
       <w:pPr>
         <w:numPr>
           <w:ilvl w:val="0"/>
-          <w:numId w:val="2"/>
+          <w:numId w:val="14"/>
         </w:numPr>
         <w:spacing w:before="100" w:beforeAutospacing="1" w:after="100" w:afterAutospacing="1"/>
         <w:rPr>
@@ -604,7 +560,7 @@
       <w:pPr>
         <w:numPr>
           <w:ilvl w:val="0"/>
-          <w:numId w:val="2"/>
+          <w:numId w:val="14"/>
         </w:numPr>
         <w:spacing w:before="100" w:beforeAutospacing="1" w:after="100" w:afterAutospacing="1"/>
         <w:rPr>
@@ -642,7 +598,7 @@
       <w:pPr>
         <w:numPr>
           <w:ilvl w:val="0"/>
-          <w:numId w:val="2"/>
+          <w:numId w:val="14"/>
         </w:numPr>
         <w:spacing w:before="100" w:beforeAutospacing="1" w:after="100" w:afterAutospacing="1"/>
         <w:rPr>
@@ -1283,7 +1239,7 @@
       <w:pPr>
         <w:numPr>
           <w:ilvl w:val="0"/>
-          <w:numId w:val="3"/>
+          <w:numId w:val="15"/>
         </w:numPr>
         <w:spacing w:before="100" w:beforeAutospacing="1" w:after="100" w:afterAutospacing="1"/>
         <w:rPr>
@@ -1321,7 +1277,7 @@
       <w:pPr>
         <w:numPr>
           <w:ilvl w:val="0"/>
-          <w:numId w:val="3"/>
+          <w:numId w:val="15"/>
         </w:numPr>
         <w:spacing w:before="100" w:beforeAutospacing="1" w:after="100" w:afterAutospacing="1"/>
         <w:rPr>
@@ -1359,7 +1315,7 @@
       <w:pPr>
         <w:numPr>
           <w:ilvl w:val="0"/>
-          <w:numId w:val="3"/>
+          <w:numId w:val="15"/>
         </w:numPr>
         <w:spacing w:before="100" w:beforeAutospacing="1" w:after="100" w:afterAutospacing="1"/>
         <w:rPr>
@@ -1428,7 +1384,7 @@
       <w:pPr>
         <w:numPr>
           <w:ilvl w:val="0"/>
-          <w:numId w:val="4"/>
+          <w:numId w:val="16"/>
         </w:numPr>
         <w:spacing w:before="100" w:beforeAutospacing="1" w:after="100" w:afterAutospacing="1"/>
         <w:rPr>
@@ -1456,7 +1412,7 @@
       <w:pPr>
         <w:numPr>
           <w:ilvl w:val="1"/>
-          <w:numId w:val="4"/>
+          <w:numId w:val="16"/>
         </w:numPr>
         <w:spacing w:before="100" w:beforeAutospacing="1" w:after="100" w:afterAutospacing="1"/>
         <w:rPr>
@@ -1482,7 +1438,7 @@
       <w:pPr>
         <w:numPr>
           <w:ilvl w:val="1"/>
-          <w:numId w:val="4"/>
+          <w:numId w:val="16"/>
         </w:numPr>
         <w:spacing w:before="100" w:beforeAutospacing="1" w:after="100" w:afterAutospacing="1"/>
         <w:rPr>
@@ -1496,19 +1452,161 @@
       <w:r>
         <w:rPr>
           <w:rFonts w:ascii="Times New Roman" w:eastAsia="Times New Roman" w:hAnsi="Times New Roman" w:cs="Times New Roman"/>
-          <w:color w:val="000000"/>
-          <w:kern w:val="0"/>
-          <w:lang w:eastAsia="en-GB"/>
-          <w14:ligatures w14:val="none"/>
-        </w:rPr>
-        <w:t>Drag-and-drop ordering of exercises.</w:t>
+          <w:b/>
+          <w:bCs/>
+          <w:color w:val="000000"/>
+          <w:kern w:val="0"/>
+          <w:lang w:eastAsia="en-GB"/>
+          <w14:ligatures w14:val="none"/>
+        </w:rPr>
+        <w:t>Modular Sections:</w:t>
+      </w:r>
+      <w:r>
+        <w:rPr>
+          <w:rFonts w:ascii="Times New Roman" w:eastAsia="Times New Roman" w:hAnsi="Times New Roman" w:cs="Times New Roman"/>
+          <w:color w:val="000000"/>
+          <w:kern w:val="0"/>
+          <w:lang w:eastAsia="en-GB"/>
+          <w14:ligatures w14:val="none"/>
+        </w:rPr>
+        <w:t> Routines are divided into distinct blocks: </w:t>
+      </w:r>
+      <w:r>
+        <w:rPr>
+          <w:rFonts w:ascii="Times New Roman" w:eastAsia="Times New Roman" w:hAnsi="Times New Roman" w:cs="Times New Roman"/>
+          <w:i/>
+          <w:iCs/>
+          <w:color w:val="000000"/>
+          <w:kern w:val="0"/>
+          <w:lang w:eastAsia="en-GB"/>
+          <w14:ligatures w14:val="none"/>
+        </w:rPr>
+        <w:t>Warmup</w:t>
+      </w:r>
+      <w:r>
+        <w:rPr>
+          <w:rFonts w:ascii="Times New Roman" w:eastAsia="Times New Roman" w:hAnsi="Times New Roman" w:cs="Times New Roman"/>
+          <w:color w:val="000000"/>
+          <w:kern w:val="0"/>
+          <w:lang w:eastAsia="en-GB"/>
+          <w14:ligatures w14:val="none"/>
+        </w:rPr>
+        <w:t>, </w:t>
+      </w:r>
+      <w:r>
+        <w:rPr>
+          <w:rFonts w:ascii="Times New Roman" w:eastAsia="Times New Roman" w:hAnsi="Times New Roman" w:cs="Times New Roman"/>
+          <w:i/>
+          <w:iCs/>
+          <w:color w:val="000000"/>
+          <w:kern w:val="0"/>
+          <w:lang w:eastAsia="en-GB"/>
+          <w14:ligatures w14:val="none"/>
+        </w:rPr>
+        <w:t>Skill Work</w:t>
+      </w:r>
+      <w:r>
+        <w:rPr>
+          <w:rFonts w:ascii="Times New Roman" w:eastAsia="Times New Roman" w:hAnsi="Times New Roman" w:cs="Times New Roman"/>
+          <w:color w:val="000000"/>
+          <w:kern w:val="0"/>
+          <w:lang w:eastAsia="en-GB"/>
+          <w14:ligatures w14:val="none"/>
+        </w:rPr>
+        <w:t>, and </w:t>
+      </w:r>
+      <w:r>
+        <w:rPr>
+          <w:rFonts w:ascii="Times New Roman" w:eastAsia="Times New Roman" w:hAnsi="Times New Roman" w:cs="Times New Roman"/>
+          <w:i/>
+          <w:iCs/>
+          <w:color w:val="000000"/>
+          <w:kern w:val="0"/>
+          <w:lang w:eastAsia="en-GB"/>
+          <w14:ligatures w14:val="none"/>
+        </w:rPr>
+        <w:t>Repertoire</w:t>
+      </w:r>
+      <w:r>
+        <w:rPr>
+          <w:rFonts w:ascii="Times New Roman" w:eastAsia="Times New Roman" w:hAnsi="Times New Roman" w:cs="Times New Roman"/>
+          <w:color w:val="000000"/>
+          <w:kern w:val="0"/>
+          <w:lang w:eastAsia="en-GB"/>
+          <w14:ligatures w14:val="none"/>
+        </w:rPr>
+        <w:t>.</w:t>
+      </w:r>
+    </w:p>
+    <w:p>
+      <w:pPr>
+        <w:numPr>
+          <w:ilvl w:val="1"/>
+          <w:numId w:val="16"/>
+        </w:numPr>
+        <w:spacing w:before="100" w:beforeAutospacing="1" w:after="100" w:afterAutospacing="1"/>
+        <w:rPr>
+          <w:rFonts w:ascii="Times New Roman" w:eastAsia="Times New Roman" w:hAnsi="Times New Roman" w:cs="Times New Roman"/>
+          <w:color w:val="000000"/>
+          <w:kern w:val="0"/>
+          <w:lang w:eastAsia="en-GB"/>
+          <w14:ligatures w14:val="none"/>
+        </w:rPr>
+      </w:pPr>
+      <w:r>
+        <w:rPr>
+          <w:rFonts w:ascii="Times New Roman" w:eastAsia="Times New Roman" w:hAnsi="Times New Roman" w:cs="Times New Roman"/>
+          <w:b/>
+          <w:bCs/>
+          <w:color w:val="000000"/>
+          <w:kern w:val="0"/>
+          <w:lang w:eastAsia="en-GB"/>
+          <w14:ligatures w14:val="none"/>
+        </w:rPr>
+        <w:t>Interactive/Clickable Modules:</w:t>
+      </w:r>
+      <w:r>
+        <w:rPr>
+          <w:rFonts w:ascii="Times New Roman" w:eastAsia="Times New Roman" w:hAnsi="Times New Roman" w:cs="Times New Roman"/>
+          <w:color w:val="000000"/>
+          <w:kern w:val="0"/>
+          <w:lang w:eastAsia="en-GB"/>
+          <w14:ligatures w14:val="none"/>
+        </w:rPr>
+        <w:t> Each section (e.g., "Warmup") is an individual clickable tile. The user can tap "Repertoire" to skip the warmup if needed, or tap a specific section to view details before starting.</w:t>
+      </w:r>
+    </w:p>
+    <w:p>
+      <w:pPr>
+        <w:numPr>
+          <w:ilvl w:val="1"/>
+          <w:numId w:val="16"/>
+        </w:numPr>
+        <w:spacing w:before="100" w:beforeAutospacing="1" w:after="100" w:afterAutospacing="1"/>
+        <w:rPr>
+          <w:rFonts w:ascii="Times New Roman" w:eastAsia="Times New Roman" w:hAnsi="Times New Roman" w:cs="Times New Roman"/>
+          <w:color w:val="000000"/>
+          <w:kern w:val="0"/>
+          <w:lang w:eastAsia="en-GB"/>
+          <w14:ligatures w14:val="none"/>
+        </w:rPr>
+      </w:pPr>
+      <w:r>
+        <w:rPr>
+          <w:rFonts w:ascii="Times New Roman" w:eastAsia="Times New Roman" w:hAnsi="Times New Roman" w:cs="Times New Roman"/>
+          <w:color w:val="000000"/>
+          <w:kern w:val="0"/>
+          <w:lang w:eastAsia="en-GB"/>
+          <w14:ligatures w14:val="none"/>
+        </w:rPr>
+        <w:t>Drag-and-drop ordering of exercises within these sections.</w:t>
       </w:r>
     </w:p>
     <w:p>
       <w:pPr>
         <w:numPr>
           <w:ilvl w:val="0"/>
-          <w:numId w:val="4"/>
+          <w:numId w:val="16"/>
         </w:numPr>
         <w:spacing w:before="100" w:beforeAutospacing="1" w:after="100" w:afterAutospacing="1"/>
         <w:rPr>
@@ -1536,7 +1634,7 @@
       <w:pPr>
         <w:numPr>
           <w:ilvl w:val="1"/>
-          <w:numId w:val="4"/>
+          <w:numId w:val="16"/>
         </w:numPr>
         <w:spacing w:before="100" w:beforeAutospacing="1" w:after="100" w:afterAutospacing="1"/>
         <w:rPr>
@@ -1574,7 +1672,7 @@
       <w:pPr>
         <w:numPr>
           <w:ilvl w:val="1"/>
-          <w:numId w:val="4"/>
+          <w:numId w:val="16"/>
         </w:numPr>
         <w:spacing w:before="100" w:beforeAutospacing="1" w:after="100" w:afterAutospacing="1"/>
         <w:rPr>
@@ -1612,7 +1710,7 @@
       <w:pPr>
         <w:numPr>
           <w:ilvl w:val="1"/>
-          <w:numId w:val="4"/>
+          <w:numId w:val="16"/>
         </w:numPr>
         <w:spacing w:before="100" w:beforeAutospacing="1" w:after="100" w:afterAutospacing="1"/>
         <w:rPr>
@@ -1640,7 +1738,7 @@
       <w:pPr>
         <w:numPr>
           <w:ilvl w:val="2"/>
-          <w:numId w:val="4"/>
+          <w:numId w:val="16"/>
         </w:numPr>
         <w:spacing w:before="100" w:beforeAutospacing="1" w:after="100" w:afterAutospacing="1"/>
         <w:rPr>
@@ -1678,7 +1776,7 @@
       <w:pPr>
         <w:numPr>
           <w:ilvl w:val="2"/>
-          <w:numId w:val="4"/>
+          <w:numId w:val="16"/>
         </w:numPr>
         <w:spacing w:before="100" w:beforeAutospacing="1" w:after="100" w:afterAutospacing="1"/>
         <w:rPr>
@@ -1716,7 +1814,7 @@
       <w:pPr>
         <w:numPr>
           <w:ilvl w:val="0"/>
-          <w:numId w:val="4"/>
+          <w:numId w:val="16"/>
         </w:numPr>
         <w:spacing w:before="100" w:beforeAutospacing="1" w:after="100" w:afterAutospacing="1"/>
         <w:rPr>
@@ -1744,7 +1842,7 @@
       <w:pPr>
         <w:numPr>
           <w:ilvl w:val="1"/>
-          <w:numId w:val="4"/>
+          <w:numId w:val="16"/>
         </w:numPr>
         <w:spacing w:before="100" w:beforeAutospacing="1" w:after="100" w:afterAutospacing="1"/>
         <w:rPr>
@@ -1782,7 +1880,7 @@
       <w:pPr>
         <w:numPr>
           <w:ilvl w:val="1"/>
-          <w:numId w:val="4"/>
+          <w:numId w:val="16"/>
         </w:numPr>
         <w:spacing w:before="100" w:beforeAutospacing="1" w:after="100" w:afterAutospacing="1"/>
         <w:rPr>
@@ -1808,7 +1906,7 @@
       <w:pPr>
         <w:numPr>
           <w:ilvl w:val="1"/>
-          <w:numId w:val="4"/>
+          <w:numId w:val="16"/>
         </w:numPr>
         <w:spacing w:before="100" w:beforeAutospacing="1" w:after="100" w:afterAutospacing="1"/>
         <w:rPr>
@@ -1877,7 +1975,7 @@
       <w:pPr>
         <w:numPr>
           <w:ilvl w:val="0"/>
-          <w:numId w:val="5"/>
+          <w:numId w:val="17"/>
         </w:numPr>
         <w:spacing w:before="100" w:beforeAutospacing="1" w:after="100" w:afterAutospacing="1"/>
         <w:rPr>
@@ -1905,7 +2003,7 @@
       <w:pPr>
         <w:numPr>
           <w:ilvl w:val="1"/>
-          <w:numId w:val="5"/>
+          <w:numId w:val="17"/>
         </w:numPr>
         <w:spacing w:before="100" w:beforeAutospacing="1" w:after="100" w:afterAutospacing="1"/>
         <w:rPr>
@@ -1931,7 +2029,7 @@
       <w:pPr>
         <w:numPr>
           <w:ilvl w:val="1"/>
-          <w:numId w:val="5"/>
+          <w:numId w:val="17"/>
         </w:numPr>
         <w:spacing w:before="100" w:beforeAutospacing="1" w:after="100" w:afterAutospacing="1"/>
         <w:rPr>
@@ -1957,7 +2055,7 @@
       <w:pPr>
         <w:numPr>
           <w:ilvl w:val="0"/>
-          <w:numId w:val="5"/>
+          <w:numId w:val="17"/>
         </w:numPr>
         <w:spacing w:before="100" w:beforeAutospacing="1" w:after="100" w:afterAutospacing="1"/>
         <w:rPr>
@@ -1978,14 +2076,14 @@
           <w:lang w:eastAsia="en-GB"/>
           <w14:ligatures w14:val="none"/>
         </w:rPr>
-        <w:t>Song Projects:</w:t>
+        <w:t>Custom Song Projects:</w:t>
       </w:r>
     </w:p>
     <w:p>
       <w:pPr>
         <w:numPr>
           <w:ilvl w:val="1"/>
-          <w:numId w:val="5"/>
+          <w:numId w:val="17"/>
         </w:numPr>
         <w:spacing w:before="100" w:beforeAutospacing="1" w:after="100" w:afterAutospacing="1"/>
         <w:rPr>
@@ -1999,19 +2097,31 @@
       <w:r>
         <w:rPr>
           <w:rFonts w:ascii="Times New Roman" w:eastAsia="Times New Roman" w:hAnsi="Times New Roman" w:cs="Times New Roman"/>
-          <w:color w:val="000000"/>
-          <w:kern w:val="0"/>
-          <w:lang w:eastAsia="en-GB"/>
-          <w14:ligatures w14:val="none"/>
-        </w:rPr>
-        <w:t>User adds a Song Title.</w:t>
+          <w:b/>
+          <w:bCs/>
+          <w:color w:val="000000"/>
+          <w:kern w:val="0"/>
+          <w:lang w:eastAsia="en-GB"/>
+          <w14:ligatures w14:val="none"/>
+        </w:rPr>
+        <w:t>Add Custom Song:</w:t>
+      </w:r>
+      <w:r>
+        <w:rPr>
+          <w:rFonts w:ascii="Times New Roman" w:eastAsia="Times New Roman" w:hAnsi="Times New Roman" w:cs="Times New Roman"/>
+          <w:color w:val="000000"/>
+          <w:kern w:val="0"/>
+          <w:lang w:eastAsia="en-GB"/>
+          <w14:ligatures w14:val="none"/>
+        </w:rPr>
+        <w:t> User manually creates a new song project by inputting Title, Artist, and Target BPM (no external database dependency).</w:t>
       </w:r>
     </w:p>
     <w:p>
       <w:pPr>
         <w:numPr>
           <w:ilvl w:val="1"/>
-          <w:numId w:val="5"/>
+          <w:numId w:val="17"/>
         </w:numPr>
         <w:spacing w:before="100" w:beforeAutospacing="1" w:after="100" w:afterAutospacing="1"/>
         <w:rPr>
@@ -2025,19 +2135,31 @@
       <w:r>
         <w:rPr>
           <w:rFonts w:ascii="Times New Roman" w:eastAsia="Times New Roman" w:hAnsi="Times New Roman" w:cs="Times New Roman"/>
-          <w:color w:val="000000"/>
-          <w:kern w:val="0"/>
-          <w:lang w:eastAsia="en-GB"/>
-          <w14:ligatures w14:val="none"/>
-        </w:rPr>
-        <w:t>User breaks song into "Sections" (Intro, Solo, Bridge).</w:t>
+          <w:b/>
+          <w:bCs/>
+          <w:color w:val="000000"/>
+          <w:kern w:val="0"/>
+          <w:lang w:eastAsia="en-GB"/>
+          <w14:ligatures w14:val="none"/>
+        </w:rPr>
+        <w:t>Section Creation:</w:t>
+      </w:r>
+      <w:r>
+        <w:rPr>
+          <w:rFonts w:ascii="Times New Roman" w:eastAsia="Times New Roman" w:hAnsi="Times New Roman" w:cs="Times New Roman"/>
+          <w:color w:val="000000"/>
+          <w:kern w:val="0"/>
+          <w:lang w:eastAsia="en-GB"/>
+          <w14:ligatures w14:val="none"/>
+        </w:rPr>
+        <w:t> User manually breaks the song into specific clickable "Sections" (e.g., Intro, Solo, Bridge) to allow for focused practice on just that part.</w:t>
       </w:r>
     </w:p>
     <w:p>
       <w:pPr>
         <w:numPr>
           <w:ilvl w:val="1"/>
-          <w:numId w:val="5"/>
+          <w:numId w:val="17"/>
         </w:numPr>
         <w:spacing w:before="100" w:beforeAutospacing="1" w:after="100" w:afterAutospacing="1"/>
         <w:rPr>
@@ -2182,7 +2304,7 @@
       <w:pPr>
         <w:numPr>
           <w:ilvl w:val="0"/>
-          <w:numId w:val="6"/>
+          <w:numId w:val="18"/>
         </w:numPr>
         <w:spacing w:before="100" w:beforeAutospacing="1" w:after="100" w:afterAutospacing="1"/>
         <w:rPr>
@@ -2220,7 +2342,7 @@
       <w:pPr>
         <w:numPr>
           <w:ilvl w:val="0"/>
-          <w:numId w:val="6"/>
+          <w:numId w:val="18"/>
         </w:numPr>
         <w:spacing w:before="100" w:beforeAutospacing="1" w:after="100" w:afterAutospacing="1"/>
         <w:rPr>
@@ -2241,6 +2363,7 @@
           <w:lang w:eastAsia="en-GB"/>
           <w14:ligatures w14:val="none"/>
         </w:rPr>
+        <w:lastRenderedPageBreak/>
         <w:t>Heatmap:</w:t>
       </w:r>
       <w:r>
@@ -2258,7 +2381,7 @@
       <w:pPr>
         <w:numPr>
           <w:ilvl w:val="0"/>
-          <w:numId w:val="6"/>
+          <w:numId w:val="18"/>
         </w:numPr>
         <w:spacing w:before="100" w:beforeAutospacing="1" w:after="100" w:afterAutospacing="1"/>
         <w:rPr>
@@ -2286,7 +2409,7 @@
       <w:pPr>
         <w:numPr>
           <w:ilvl w:val="1"/>
-          <w:numId w:val="6"/>
+          <w:numId w:val="18"/>
         </w:numPr>
         <w:spacing w:before="100" w:beforeAutospacing="1" w:after="100" w:afterAutospacing="1"/>
         <w:rPr>
@@ -2379,7 +2502,6 @@
           <w:lang w:eastAsia="en-GB"/>
           <w14:ligatures w14:val="none"/>
         </w:rPr>
-        <w:lastRenderedPageBreak/>
         <w:t>Platform</w:t>
       </w:r>
     </w:p>
@@ -2387,7 +2509,7 @@
       <w:pPr>
         <w:numPr>
           <w:ilvl w:val="0"/>
-          <w:numId w:val="7"/>
+          <w:numId w:val="19"/>
         </w:numPr>
         <w:spacing w:before="100" w:beforeAutospacing="1" w:after="100" w:afterAutospacing="1"/>
         <w:rPr>
@@ -2418,36 +2540,14 @@
           <w:lang w:eastAsia="en-GB"/>
           <w14:ligatures w14:val="none"/>
         </w:rPr>
-        <w:t> iOS (Swift/</w:t>
-      </w:r>
-      <w:proofErr w:type="spellStart"/>
-      <w:r>
-        <w:rPr>
-          <w:rFonts w:ascii="Times New Roman" w:eastAsia="Times New Roman" w:hAnsi="Times New Roman" w:cs="Times New Roman"/>
-          <w:color w:val="000000"/>
-          <w:kern w:val="0"/>
-          <w:lang w:eastAsia="en-GB"/>
-          <w14:ligatures w14:val="none"/>
-        </w:rPr>
-        <w:t>SwiftUI</w:t>
-      </w:r>
-      <w:proofErr w:type="spellEnd"/>
-      <w:r>
-        <w:rPr>
-          <w:rFonts w:ascii="Times New Roman" w:eastAsia="Times New Roman" w:hAnsi="Times New Roman" w:cs="Times New Roman"/>
-          <w:color w:val="000000"/>
-          <w:kern w:val="0"/>
-          <w:lang w:eastAsia="en-GB"/>
-          <w14:ligatures w14:val="none"/>
-        </w:rPr>
-        <w:t>) - Priority market.</w:t>
+        <w:t> iOS (Swift/SwiftUI) - Priority market.</w:t>
       </w:r>
     </w:p>
     <w:p>
       <w:pPr>
         <w:numPr>
           <w:ilvl w:val="0"/>
-          <w:numId w:val="7"/>
+          <w:numId w:val="19"/>
         </w:numPr>
         <w:spacing w:before="100" w:beforeAutospacing="1" w:after="100" w:afterAutospacing="1"/>
         <w:rPr>
@@ -2485,7 +2585,7 @@
       <w:pPr>
         <w:numPr>
           <w:ilvl w:val="0"/>
-          <w:numId w:val="7"/>
+          <w:numId w:val="19"/>
         </w:numPr>
         <w:spacing w:before="100" w:beforeAutospacing="1" w:after="100" w:afterAutospacing="1"/>
         <w:rPr>
@@ -2554,7 +2654,7 @@
       <w:pPr>
         <w:numPr>
           <w:ilvl w:val="0"/>
-          <w:numId w:val="8"/>
+          <w:numId w:val="20"/>
         </w:numPr>
         <w:spacing w:before="100" w:beforeAutospacing="1" w:after="100" w:afterAutospacing="1"/>
         <w:rPr>
@@ -2592,7 +2692,7 @@
       <w:pPr>
         <w:numPr>
           <w:ilvl w:val="0"/>
-          <w:numId w:val="8"/>
+          <w:numId w:val="20"/>
         </w:numPr>
         <w:spacing w:before="100" w:beforeAutospacing="1" w:after="100" w:afterAutospacing="1"/>
         <w:rPr>
@@ -2623,36 +2723,14 @@
           <w:lang w:eastAsia="en-GB"/>
           <w14:ligatures w14:val="none"/>
         </w:rPr>
-        <w:t> Firebase/</w:t>
-      </w:r>
-      <w:proofErr w:type="spellStart"/>
-      <w:r>
-        <w:rPr>
-          <w:rFonts w:ascii="Times New Roman" w:eastAsia="Times New Roman" w:hAnsi="Times New Roman" w:cs="Times New Roman"/>
-          <w:color w:val="000000"/>
-          <w:kern w:val="0"/>
-          <w:lang w:eastAsia="en-GB"/>
-          <w14:ligatures w14:val="none"/>
-        </w:rPr>
-        <w:t>Supabase</w:t>
-      </w:r>
-      <w:proofErr w:type="spellEnd"/>
-      <w:r>
-        <w:rPr>
-          <w:rFonts w:ascii="Times New Roman" w:eastAsia="Times New Roman" w:hAnsi="Times New Roman" w:cs="Times New Roman"/>
-          <w:color w:val="000000"/>
-          <w:kern w:val="0"/>
-          <w:lang w:eastAsia="en-GB"/>
-          <w14:ligatures w14:val="none"/>
-        </w:rPr>
-        <w:t xml:space="preserve"> for backing up user data/images across devices.</w:t>
+        <w:t> Firebase/Supabase for backing up user data/images across devices.</w:t>
       </w:r>
     </w:p>
     <w:p>
       <w:pPr>
         <w:numPr>
           <w:ilvl w:val="0"/>
-          <w:numId w:val="8"/>
+          <w:numId w:val="20"/>
         </w:numPr>
         <w:spacing w:before="100" w:beforeAutospacing="1" w:after="100" w:afterAutospacing="1"/>
         <w:rPr>
@@ -2721,7 +2799,7 @@
       <w:pPr>
         <w:numPr>
           <w:ilvl w:val="0"/>
-          <w:numId w:val="9"/>
+          <w:numId w:val="21"/>
         </w:numPr>
         <w:spacing w:before="100" w:beforeAutospacing="1" w:after="100" w:afterAutospacing="1"/>
         <w:rPr>
@@ -2759,7 +2837,7 @@
       <w:pPr>
         <w:numPr>
           <w:ilvl w:val="0"/>
-          <w:numId w:val="9"/>
+          <w:numId w:val="21"/>
         </w:numPr>
         <w:spacing w:before="100" w:beforeAutospacing="1" w:after="100" w:afterAutospacing="1"/>
         <w:rPr>
@@ -2828,7 +2906,7 @@
       <w:pPr>
         <w:numPr>
           <w:ilvl w:val="0"/>
-          <w:numId w:val="10"/>
+          <w:numId w:val="22"/>
         </w:numPr>
         <w:spacing w:before="100" w:beforeAutospacing="1" w:after="100" w:afterAutospacing="1"/>
         <w:rPr>
@@ -2866,7 +2944,7 @@
       <w:pPr>
         <w:numPr>
           <w:ilvl w:val="0"/>
-          <w:numId w:val="10"/>
+          <w:numId w:val="22"/>
         </w:numPr>
         <w:spacing w:before="100" w:beforeAutospacing="1" w:after="100" w:afterAutospacing="1"/>
         <w:rPr>
@@ -2894,7 +2972,7 @@
       <w:pPr>
         <w:numPr>
           <w:ilvl w:val="1"/>
-          <w:numId w:val="10"/>
+          <w:numId w:val="22"/>
         </w:numPr>
         <w:spacing w:before="100" w:beforeAutospacing="1" w:after="100" w:afterAutospacing="1"/>
         <w:rPr>
@@ -2925,36 +3003,14 @@
           <w:lang w:eastAsia="en-GB"/>
           <w14:ligatures w14:val="none"/>
         </w:rPr>
-        <w:t xml:space="preserve"> Buttons must be tappable with a guitar pick in hand or with the </w:t>
-      </w:r>
-      <w:proofErr w:type="spellStart"/>
-      <w:r>
-        <w:rPr>
-          <w:rFonts w:ascii="Times New Roman" w:eastAsia="Times New Roman" w:hAnsi="Times New Roman" w:cs="Times New Roman"/>
-          <w:color w:val="000000"/>
-          <w:kern w:val="0"/>
-          <w:lang w:eastAsia="en-GB"/>
-          <w14:ligatures w14:val="none"/>
-        </w:rPr>
-        <w:t>pinky</w:t>
-      </w:r>
-      <w:proofErr w:type="spellEnd"/>
-      <w:r>
-        <w:rPr>
-          <w:rFonts w:ascii="Times New Roman" w:eastAsia="Times New Roman" w:hAnsi="Times New Roman" w:cs="Times New Roman"/>
-          <w:color w:val="000000"/>
-          <w:kern w:val="0"/>
-          <w:lang w:eastAsia="en-GB"/>
-          <w14:ligatures w14:val="none"/>
-        </w:rPr>
-        <w:t xml:space="preserve"> finger.</w:t>
+        <w:t> Buttons must be tappable with a guitar pick in hand or with the pinky finger.</w:t>
       </w:r>
     </w:p>
     <w:p>
       <w:pPr>
         <w:numPr>
           <w:ilvl w:val="1"/>
-          <w:numId w:val="10"/>
+          <w:numId w:val="22"/>
         </w:numPr>
         <w:spacing w:before="100" w:beforeAutospacing="1" w:after="100" w:afterAutospacing="1"/>
         <w:rPr>
@@ -3023,7 +3079,7 @@
       <w:pPr>
         <w:numPr>
           <w:ilvl w:val="0"/>
-          <w:numId w:val="11"/>
+          <w:numId w:val="23"/>
         </w:numPr>
         <w:spacing w:before="100" w:beforeAutospacing="1" w:after="100" w:afterAutospacing="1"/>
         <w:rPr>
@@ -3051,7 +3107,7 @@
       <w:pPr>
         <w:numPr>
           <w:ilvl w:val="1"/>
-          <w:numId w:val="11"/>
+          <w:numId w:val="23"/>
         </w:numPr>
         <w:spacing w:before="100" w:beforeAutospacing="1" w:after="100" w:afterAutospacing="1"/>
         <w:rPr>
@@ -3077,7 +3133,7 @@
       <w:pPr>
         <w:numPr>
           <w:ilvl w:val="1"/>
-          <w:numId w:val="11"/>
+          <w:numId w:val="23"/>
         </w:numPr>
         <w:spacing w:before="100" w:beforeAutospacing="1" w:after="100" w:afterAutospacing="1"/>
         <w:rPr>
@@ -3103,7 +3159,7 @@
       <w:pPr>
         <w:numPr>
           <w:ilvl w:val="1"/>
-          <w:numId w:val="11"/>
+          <w:numId w:val="23"/>
         </w:numPr>
         <w:spacing w:before="100" w:beforeAutospacing="1" w:after="100" w:afterAutospacing="1"/>
         <w:rPr>
@@ -3129,7 +3185,7 @@
       <w:pPr>
         <w:numPr>
           <w:ilvl w:val="1"/>
-          <w:numId w:val="11"/>
+          <w:numId w:val="23"/>
         </w:numPr>
         <w:spacing w:before="100" w:beforeAutospacing="1" w:after="100" w:afterAutospacing="1"/>
         <w:rPr>
@@ -3155,7 +3211,7 @@
       <w:pPr>
         <w:numPr>
           <w:ilvl w:val="0"/>
-          <w:numId w:val="11"/>
+          <w:numId w:val="23"/>
         </w:numPr>
         <w:spacing w:before="100" w:beforeAutospacing="1" w:after="100" w:afterAutospacing="1"/>
         <w:rPr>
@@ -3176,40 +3232,14 @@
           <w:lang w:eastAsia="en-GB"/>
           <w14:ligatures w14:val="none"/>
         </w:rPr>
-        <w:t>Pro Tier (The Personal Trainer) - $4.99/</w:t>
-      </w:r>
-      <w:proofErr w:type="spellStart"/>
-      <w:r>
-        <w:rPr>
-          <w:rFonts w:ascii="Times New Roman" w:eastAsia="Times New Roman" w:hAnsi="Times New Roman" w:cs="Times New Roman"/>
-          <w:b/>
-          <w:bCs/>
-          <w:color w:val="000000"/>
-          <w:kern w:val="0"/>
-          <w:lang w:eastAsia="en-GB"/>
-          <w14:ligatures w14:val="none"/>
-        </w:rPr>
-        <w:t>mo</w:t>
-      </w:r>
-      <w:proofErr w:type="spellEnd"/>
-      <w:r>
-        <w:rPr>
-          <w:rFonts w:ascii="Times New Roman" w:eastAsia="Times New Roman" w:hAnsi="Times New Roman" w:cs="Times New Roman"/>
-          <w:b/>
-          <w:bCs/>
-          <w:color w:val="000000"/>
-          <w:kern w:val="0"/>
-          <w:lang w:eastAsia="en-GB"/>
-          <w14:ligatures w14:val="none"/>
-        </w:rPr>
-        <w:t>:</w:t>
+        <w:t>Pro Tier (The Personal Trainer) - $4.99/mo:</w:t>
       </w:r>
     </w:p>
     <w:p>
       <w:pPr>
         <w:numPr>
           <w:ilvl w:val="1"/>
-          <w:numId w:val="11"/>
+          <w:numId w:val="23"/>
         </w:numPr>
         <w:spacing w:before="100" w:beforeAutospacing="1" w:after="100" w:afterAutospacing="1"/>
         <w:rPr>
@@ -3228,6 +3258,7 @@
           <w:lang w:eastAsia="en-GB"/>
           <w14:ligatures w14:val="none"/>
         </w:rPr>
+        <w:lastRenderedPageBreak/>
         <w:t>Unlimited Songs &amp; Routines.</w:t>
       </w:r>
     </w:p>
@@ -3235,7 +3266,7 @@
       <w:pPr>
         <w:numPr>
           <w:ilvl w:val="1"/>
-          <w:numId w:val="11"/>
+          <w:numId w:val="23"/>
         </w:numPr>
         <w:spacing w:before="100" w:beforeAutospacing="1" w:after="100" w:afterAutospacing="1"/>
         <w:rPr>
@@ -3261,7 +3292,7 @@
       <w:pPr>
         <w:numPr>
           <w:ilvl w:val="1"/>
-          <w:numId w:val="11"/>
+          <w:numId w:val="23"/>
         </w:numPr>
         <w:spacing w:before="100" w:beforeAutospacing="1" w:after="100" w:afterAutospacing="1"/>
         <w:rPr>
@@ -3287,7 +3318,7 @@
       <w:pPr>
         <w:numPr>
           <w:ilvl w:val="1"/>
-          <w:numId w:val="11"/>
+          <w:numId w:val="23"/>
         </w:numPr>
         <w:spacing w:before="100" w:beforeAutospacing="1" w:after="100" w:afterAutospacing="1"/>
         <w:rPr>
@@ -3344,7 +3375,7 @@
       <w:pPr>
         <w:numPr>
           <w:ilvl w:val="0"/>
-          <w:numId w:val="12"/>
+          <w:numId w:val="24"/>
         </w:numPr>
         <w:spacing w:before="100" w:beforeAutospacing="1" w:after="100" w:afterAutospacing="1"/>
         <w:rPr>
@@ -3382,7 +3413,7 @@
       <w:pPr>
         <w:numPr>
           <w:ilvl w:val="0"/>
-          <w:numId w:val="12"/>
+          <w:numId w:val="24"/>
         </w:numPr>
         <w:spacing w:before="100" w:beforeAutospacing="1" w:after="100" w:afterAutospacing="1"/>
         <w:rPr>
@@ -3403,7 +3434,6 @@
           <w:lang w:eastAsia="en-GB"/>
           <w14:ligatures w14:val="none"/>
         </w:rPr>
-        <w:lastRenderedPageBreak/>
         <w:t>Session Length:</w:t>
       </w:r>
       <w:r>
@@ -3421,7 +3451,7 @@
       <w:pPr>
         <w:numPr>
           <w:ilvl w:val="0"/>
-          <w:numId w:val="12"/>
+          <w:numId w:val="24"/>
         </w:numPr>
         <w:spacing w:before="100" w:beforeAutospacing="1" w:after="100" w:afterAutospacing="1"/>
         <w:rPr>
@@ -3459,7 +3489,7 @@
       <w:pPr>
         <w:numPr>
           <w:ilvl w:val="0"/>
-          <w:numId w:val="12"/>
+          <w:numId w:val="24"/>
         </w:numPr>
         <w:spacing w:before="100" w:beforeAutospacing="1" w:after="100" w:afterAutospacing="1"/>
         <w:rPr>
@@ -3507,6 +3537,566 @@
 <file path=word/numbering.xml><?xml version="1.0" encoding="utf-8"?>
 <w:numbering xmlns:wpc="http://schemas.microsoft.com/office/word/2010/wordprocessingCanvas" xmlns:cx="http://schemas.microsoft.com/office/drawing/2014/chartex" xmlns:cx1="http://schemas.microsoft.com/office/drawing/2015/9/8/chartex" xmlns:cx2="http://schemas.microsoft.com/office/drawing/2015/10/21/chartex" xmlns:cx3="http://schemas.microsoft.com/office/drawing/2016/5/9/chartex" xmlns:cx4="http://schemas.microsoft.com/office/drawing/2016/5/10/chartex" xmlns:cx5="http://schemas.microsoft.com/office/drawing/2016/5/11/chartex" xmlns:cx6="http://schemas.microsoft.com/office/drawing/2016/5/12/chartex" xmlns:cx7="http://schemas.microsoft.com/office/drawing/2016/5/13/chartex" xmlns:cx8="http://schemas.microsoft.com/office/drawing/2016/5/14/chartex" xmlns:mc="http://schemas.openxmlformats.org/markup-compatibility/2006" xmlns:aink="http://schemas.microsoft.com/office/drawing/2016/ink" xmlns:am3d="http://schemas.microsoft.com/office/drawing/2017/model3d" xmlns:o="urn:schemas-microsoft-com:office:office" xmlns:oel="http://schemas.microsoft.com/office/2019/extlst" xmlns:r="http://schemas.openxmlformats.org/officeDocument/2006/relationships" xmlns:m="http://schemas.openxmlformats.org/officeDocument/2006/math" xmlns:v="urn:schemas-microsoft-com:vml" xmlns:wp14="http://schemas.microsoft.com/office/word/2010/wordprocessingDrawing" xmlns:wp="http://schemas.openxmlformats.org/drawingml/2006/wordprocessingDrawing" xmlns:w10="urn:schemas-microsoft-com:office:word" xmlns:w="http://schemas.openxmlformats.org/wordprocessingml/2006/main" xmlns:w14="http://schemas.microsoft.com/office/word/2010/wordml" xmlns:w15="http://schemas.microsoft.com/office/word/2012/wordml" xmlns:w16cex="http://schemas.microsoft.com/office/word/2018/wordml/cex" xmlns:w16cid="http://schemas.microsoft.com/office/word/2016/wordml/cid" xmlns:w16="http://schemas.microsoft.com/office/word/2018/wordml" xmlns:w16sdtdh="http://schemas.microsoft.com/office/word/2020/wordml/sdtdatahash" xmlns:w16se="http://schemas.microsoft.com/office/word/2015/wordml/symex" xmlns:wpg="http://schemas.microsoft.com/office/word/2010/wordprocessingGroup" xmlns:wpi="http://schemas.microsoft.com/office/word/2010/wordprocessingInk" xmlns:wne="http://schemas.microsoft.com/office/word/2006/wordml" xmlns:wps="http://schemas.microsoft.com/office/word/2010/wordprocessingShape" mc:Ignorable="w14 w15 w16se w16cid w16 w16cex w16sdtdh wp14">
   <w:abstractNum w:abstractNumId="0" w15:restartNumberingAfterBreak="0">
+    <w:nsid w:val="00A45353"/>
+    <w:multiLevelType w:val="multilevel"/>
+    <w:tmpl w:val="BB948E76"/>
+    <w:lvl w:ilvl="0">
+      <w:start w:val="1"/>
+      <w:numFmt w:val="bullet"/>
+      <w:lvlText w:val=""/>
+      <w:lvlJc w:val="left"/>
+      <w:pPr>
+        <w:tabs>
+          <w:tab w:val="num" w:pos="720"/>
+        </w:tabs>
+        <w:ind w:left="720" w:hanging="360"/>
+      </w:pPr>
+      <w:rPr>
+        <w:rFonts w:ascii="Symbol" w:hAnsi="Symbol" w:hint="default"/>
+        <w:sz w:val="20"/>
+      </w:rPr>
+    </w:lvl>
+    <w:lvl w:ilvl="1" w:tentative="1">
+      <w:start w:val="1"/>
+      <w:numFmt w:val="bullet"/>
+      <w:lvlText w:val="o"/>
+      <w:lvlJc w:val="left"/>
+      <w:pPr>
+        <w:tabs>
+          <w:tab w:val="num" w:pos="1440"/>
+        </w:tabs>
+        <w:ind w:left="1440" w:hanging="360"/>
+      </w:pPr>
+      <w:rPr>
+        <w:rFonts w:ascii="Courier New" w:hAnsi="Courier New" w:hint="default"/>
+        <w:sz w:val="20"/>
+      </w:rPr>
+    </w:lvl>
+    <w:lvl w:ilvl="2" w:tentative="1">
+      <w:start w:val="1"/>
+      <w:numFmt w:val="bullet"/>
+      <w:lvlText w:val=""/>
+      <w:lvlJc w:val="left"/>
+      <w:pPr>
+        <w:tabs>
+          <w:tab w:val="num" w:pos="2160"/>
+        </w:tabs>
+        <w:ind w:left="2160" w:hanging="360"/>
+      </w:pPr>
+      <w:rPr>
+        <w:rFonts w:ascii="Wingdings" w:hAnsi="Wingdings" w:hint="default"/>
+        <w:sz w:val="20"/>
+      </w:rPr>
+    </w:lvl>
+    <w:lvl w:ilvl="3" w:tentative="1">
+      <w:start w:val="1"/>
+      <w:numFmt w:val="bullet"/>
+      <w:lvlText w:val=""/>
+      <w:lvlJc w:val="left"/>
+      <w:pPr>
+        <w:tabs>
+          <w:tab w:val="num" w:pos="2880"/>
+        </w:tabs>
+        <w:ind w:left="2880" w:hanging="360"/>
+      </w:pPr>
+      <w:rPr>
+        <w:rFonts w:ascii="Wingdings" w:hAnsi="Wingdings" w:hint="default"/>
+        <w:sz w:val="20"/>
+      </w:rPr>
+    </w:lvl>
+    <w:lvl w:ilvl="4" w:tentative="1">
+      <w:start w:val="1"/>
+      <w:numFmt w:val="bullet"/>
+      <w:lvlText w:val=""/>
+      <w:lvlJc w:val="left"/>
+      <w:pPr>
+        <w:tabs>
+          <w:tab w:val="num" w:pos="3600"/>
+        </w:tabs>
+        <w:ind w:left="3600" w:hanging="360"/>
+      </w:pPr>
+      <w:rPr>
+        <w:rFonts w:ascii="Wingdings" w:hAnsi="Wingdings" w:hint="default"/>
+        <w:sz w:val="20"/>
+      </w:rPr>
+    </w:lvl>
+    <w:lvl w:ilvl="5" w:tentative="1">
+      <w:start w:val="1"/>
+      <w:numFmt w:val="bullet"/>
+      <w:lvlText w:val=""/>
+      <w:lvlJc w:val="left"/>
+      <w:pPr>
+        <w:tabs>
+          <w:tab w:val="num" w:pos="4320"/>
+        </w:tabs>
+        <w:ind w:left="4320" w:hanging="360"/>
+      </w:pPr>
+      <w:rPr>
+        <w:rFonts w:ascii="Wingdings" w:hAnsi="Wingdings" w:hint="default"/>
+        <w:sz w:val="20"/>
+      </w:rPr>
+    </w:lvl>
+    <w:lvl w:ilvl="6" w:tentative="1">
+      <w:start w:val="1"/>
+      <w:numFmt w:val="bullet"/>
+      <w:lvlText w:val=""/>
+      <w:lvlJc w:val="left"/>
+      <w:pPr>
+        <w:tabs>
+          <w:tab w:val="num" w:pos="5040"/>
+        </w:tabs>
+        <w:ind w:left="5040" w:hanging="360"/>
+      </w:pPr>
+      <w:rPr>
+        <w:rFonts w:ascii="Wingdings" w:hAnsi="Wingdings" w:hint="default"/>
+        <w:sz w:val="20"/>
+      </w:rPr>
+    </w:lvl>
+    <w:lvl w:ilvl="7" w:tentative="1">
+      <w:start w:val="1"/>
+      <w:numFmt w:val="bullet"/>
+      <w:lvlText w:val=""/>
+      <w:lvlJc w:val="left"/>
+      <w:pPr>
+        <w:tabs>
+          <w:tab w:val="num" w:pos="5760"/>
+        </w:tabs>
+        <w:ind w:left="5760" w:hanging="360"/>
+      </w:pPr>
+      <w:rPr>
+        <w:rFonts w:ascii="Wingdings" w:hAnsi="Wingdings" w:hint="default"/>
+        <w:sz w:val="20"/>
+      </w:rPr>
+    </w:lvl>
+    <w:lvl w:ilvl="8" w:tentative="1">
+      <w:start w:val="1"/>
+      <w:numFmt w:val="bullet"/>
+      <w:lvlText w:val=""/>
+      <w:lvlJc w:val="left"/>
+      <w:pPr>
+        <w:tabs>
+          <w:tab w:val="num" w:pos="6480"/>
+        </w:tabs>
+        <w:ind w:left="6480" w:hanging="360"/>
+      </w:pPr>
+      <w:rPr>
+        <w:rFonts w:ascii="Wingdings" w:hAnsi="Wingdings" w:hint="default"/>
+        <w:sz w:val="20"/>
+      </w:rPr>
+    </w:lvl>
+  </w:abstractNum>
+  <w:abstractNum w:abstractNumId="1" w15:restartNumberingAfterBreak="0">
+    <w:nsid w:val="04706110"/>
+    <w:multiLevelType w:val="multilevel"/>
+    <w:tmpl w:val="FADC63E8"/>
+    <w:lvl w:ilvl="0">
+      <w:start w:val="1"/>
+      <w:numFmt w:val="bullet"/>
+      <w:lvlText w:val=""/>
+      <w:lvlJc w:val="left"/>
+      <w:pPr>
+        <w:tabs>
+          <w:tab w:val="num" w:pos="720"/>
+        </w:tabs>
+        <w:ind w:left="720" w:hanging="360"/>
+      </w:pPr>
+      <w:rPr>
+        <w:rFonts w:ascii="Symbol" w:hAnsi="Symbol" w:hint="default"/>
+        <w:sz w:val="20"/>
+      </w:rPr>
+    </w:lvl>
+    <w:lvl w:ilvl="1" w:tentative="1">
+      <w:start w:val="1"/>
+      <w:numFmt w:val="bullet"/>
+      <w:lvlText w:val="o"/>
+      <w:lvlJc w:val="left"/>
+      <w:pPr>
+        <w:tabs>
+          <w:tab w:val="num" w:pos="1440"/>
+        </w:tabs>
+        <w:ind w:left="1440" w:hanging="360"/>
+      </w:pPr>
+      <w:rPr>
+        <w:rFonts w:ascii="Courier New" w:hAnsi="Courier New" w:hint="default"/>
+        <w:sz w:val="20"/>
+      </w:rPr>
+    </w:lvl>
+    <w:lvl w:ilvl="2" w:tentative="1">
+      <w:start w:val="1"/>
+      <w:numFmt w:val="bullet"/>
+      <w:lvlText w:val=""/>
+      <w:lvlJc w:val="left"/>
+      <w:pPr>
+        <w:tabs>
+          <w:tab w:val="num" w:pos="2160"/>
+        </w:tabs>
+        <w:ind w:left="2160" w:hanging="360"/>
+      </w:pPr>
+      <w:rPr>
+        <w:rFonts w:ascii="Wingdings" w:hAnsi="Wingdings" w:hint="default"/>
+        <w:sz w:val="20"/>
+      </w:rPr>
+    </w:lvl>
+    <w:lvl w:ilvl="3" w:tentative="1">
+      <w:start w:val="1"/>
+      <w:numFmt w:val="bullet"/>
+      <w:lvlText w:val=""/>
+      <w:lvlJc w:val="left"/>
+      <w:pPr>
+        <w:tabs>
+          <w:tab w:val="num" w:pos="2880"/>
+        </w:tabs>
+        <w:ind w:left="2880" w:hanging="360"/>
+      </w:pPr>
+      <w:rPr>
+        <w:rFonts w:ascii="Wingdings" w:hAnsi="Wingdings" w:hint="default"/>
+        <w:sz w:val="20"/>
+      </w:rPr>
+    </w:lvl>
+    <w:lvl w:ilvl="4" w:tentative="1">
+      <w:start w:val="1"/>
+      <w:numFmt w:val="bullet"/>
+      <w:lvlText w:val=""/>
+      <w:lvlJc w:val="left"/>
+      <w:pPr>
+        <w:tabs>
+          <w:tab w:val="num" w:pos="3600"/>
+        </w:tabs>
+        <w:ind w:left="3600" w:hanging="360"/>
+      </w:pPr>
+      <w:rPr>
+        <w:rFonts w:ascii="Wingdings" w:hAnsi="Wingdings" w:hint="default"/>
+        <w:sz w:val="20"/>
+      </w:rPr>
+    </w:lvl>
+    <w:lvl w:ilvl="5" w:tentative="1">
+      <w:start w:val="1"/>
+      <w:numFmt w:val="bullet"/>
+      <w:lvlText w:val=""/>
+      <w:lvlJc w:val="left"/>
+      <w:pPr>
+        <w:tabs>
+          <w:tab w:val="num" w:pos="4320"/>
+        </w:tabs>
+        <w:ind w:left="4320" w:hanging="360"/>
+      </w:pPr>
+      <w:rPr>
+        <w:rFonts w:ascii="Wingdings" w:hAnsi="Wingdings" w:hint="default"/>
+        <w:sz w:val="20"/>
+      </w:rPr>
+    </w:lvl>
+    <w:lvl w:ilvl="6" w:tentative="1">
+      <w:start w:val="1"/>
+      <w:numFmt w:val="bullet"/>
+      <w:lvlText w:val=""/>
+      <w:lvlJc w:val="left"/>
+      <w:pPr>
+        <w:tabs>
+          <w:tab w:val="num" w:pos="5040"/>
+        </w:tabs>
+        <w:ind w:left="5040" w:hanging="360"/>
+      </w:pPr>
+      <w:rPr>
+        <w:rFonts w:ascii="Wingdings" w:hAnsi="Wingdings" w:hint="default"/>
+        <w:sz w:val="20"/>
+      </w:rPr>
+    </w:lvl>
+    <w:lvl w:ilvl="7" w:tentative="1">
+      <w:start w:val="1"/>
+      <w:numFmt w:val="bullet"/>
+      <w:lvlText w:val=""/>
+      <w:lvlJc w:val="left"/>
+      <w:pPr>
+        <w:tabs>
+          <w:tab w:val="num" w:pos="5760"/>
+        </w:tabs>
+        <w:ind w:left="5760" w:hanging="360"/>
+      </w:pPr>
+      <w:rPr>
+        <w:rFonts w:ascii="Wingdings" w:hAnsi="Wingdings" w:hint="default"/>
+        <w:sz w:val="20"/>
+      </w:rPr>
+    </w:lvl>
+    <w:lvl w:ilvl="8" w:tentative="1">
+      <w:start w:val="1"/>
+      <w:numFmt w:val="bullet"/>
+      <w:lvlText w:val=""/>
+      <w:lvlJc w:val="left"/>
+      <w:pPr>
+        <w:tabs>
+          <w:tab w:val="num" w:pos="6480"/>
+        </w:tabs>
+        <w:ind w:left="6480" w:hanging="360"/>
+      </w:pPr>
+      <w:rPr>
+        <w:rFonts w:ascii="Wingdings" w:hAnsi="Wingdings" w:hint="default"/>
+        <w:sz w:val="20"/>
+      </w:rPr>
+    </w:lvl>
+  </w:abstractNum>
+  <w:abstractNum w:abstractNumId="2" w15:restartNumberingAfterBreak="0">
+    <w:nsid w:val="08B71601"/>
+    <w:multiLevelType w:val="multilevel"/>
+    <w:tmpl w:val="AB30FC72"/>
+    <w:lvl w:ilvl="0">
+      <w:start w:val="1"/>
+      <w:numFmt w:val="bullet"/>
+      <w:lvlText w:val=""/>
+      <w:lvlJc w:val="left"/>
+      <w:pPr>
+        <w:tabs>
+          <w:tab w:val="num" w:pos="720"/>
+        </w:tabs>
+        <w:ind w:left="720" w:hanging="360"/>
+      </w:pPr>
+      <w:rPr>
+        <w:rFonts w:ascii="Symbol" w:hAnsi="Symbol" w:hint="default"/>
+        <w:sz w:val="20"/>
+      </w:rPr>
+    </w:lvl>
+    <w:lvl w:ilvl="1" w:tentative="1">
+      <w:start w:val="1"/>
+      <w:numFmt w:val="bullet"/>
+      <w:lvlText w:val="o"/>
+      <w:lvlJc w:val="left"/>
+      <w:pPr>
+        <w:tabs>
+          <w:tab w:val="num" w:pos="1440"/>
+        </w:tabs>
+        <w:ind w:left="1440" w:hanging="360"/>
+      </w:pPr>
+      <w:rPr>
+        <w:rFonts w:ascii="Courier New" w:hAnsi="Courier New" w:hint="default"/>
+        <w:sz w:val="20"/>
+      </w:rPr>
+    </w:lvl>
+    <w:lvl w:ilvl="2" w:tentative="1">
+      <w:start w:val="1"/>
+      <w:numFmt w:val="bullet"/>
+      <w:lvlText w:val=""/>
+      <w:lvlJc w:val="left"/>
+      <w:pPr>
+        <w:tabs>
+          <w:tab w:val="num" w:pos="2160"/>
+        </w:tabs>
+        <w:ind w:left="2160" w:hanging="360"/>
+      </w:pPr>
+      <w:rPr>
+        <w:rFonts w:ascii="Wingdings" w:hAnsi="Wingdings" w:hint="default"/>
+        <w:sz w:val="20"/>
+      </w:rPr>
+    </w:lvl>
+    <w:lvl w:ilvl="3" w:tentative="1">
+      <w:start w:val="1"/>
+      <w:numFmt w:val="bullet"/>
+      <w:lvlText w:val=""/>
+      <w:lvlJc w:val="left"/>
+      <w:pPr>
+        <w:tabs>
+          <w:tab w:val="num" w:pos="2880"/>
+        </w:tabs>
+        <w:ind w:left="2880" w:hanging="360"/>
+      </w:pPr>
+      <w:rPr>
+        <w:rFonts w:ascii="Wingdings" w:hAnsi="Wingdings" w:hint="default"/>
+        <w:sz w:val="20"/>
+      </w:rPr>
+    </w:lvl>
+    <w:lvl w:ilvl="4" w:tentative="1">
+      <w:start w:val="1"/>
+      <w:numFmt w:val="bullet"/>
+      <w:lvlText w:val=""/>
+      <w:lvlJc w:val="left"/>
+      <w:pPr>
+        <w:tabs>
+          <w:tab w:val="num" w:pos="3600"/>
+        </w:tabs>
+        <w:ind w:left="3600" w:hanging="360"/>
+      </w:pPr>
+      <w:rPr>
+        <w:rFonts w:ascii="Wingdings" w:hAnsi="Wingdings" w:hint="default"/>
+        <w:sz w:val="20"/>
+      </w:rPr>
+    </w:lvl>
+    <w:lvl w:ilvl="5" w:tentative="1">
+      <w:start w:val="1"/>
+      <w:numFmt w:val="bullet"/>
+      <w:lvlText w:val=""/>
+      <w:lvlJc w:val="left"/>
+      <w:pPr>
+        <w:tabs>
+          <w:tab w:val="num" w:pos="4320"/>
+        </w:tabs>
+        <w:ind w:left="4320" w:hanging="360"/>
+      </w:pPr>
+      <w:rPr>
+        <w:rFonts w:ascii="Wingdings" w:hAnsi="Wingdings" w:hint="default"/>
+        <w:sz w:val="20"/>
+      </w:rPr>
+    </w:lvl>
+    <w:lvl w:ilvl="6" w:tentative="1">
+      <w:start w:val="1"/>
+      <w:numFmt w:val="bullet"/>
+      <w:lvlText w:val=""/>
+      <w:lvlJc w:val="left"/>
+      <w:pPr>
+        <w:tabs>
+          <w:tab w:val="num" w:pos="5040"/>
+        </w:tabs>
+        <w:ind w:left="5040" w:hanging="360"/>
+      </w:pPr>
+      <w:rPr>
+        <w:rFonts w:ascii="Wingdings" w:hAnsi="Wingdings" w:hint="default"/>
+        <w:sz w:val="20"/>
+      </w:rPr>
+    </w:lvl>
+    <w:lvl w:ilvl="7" w:tentative="1">
+      <w:start w:val="1"/>
+      <w:numFmt w:val="bullet"/>
+      <w:lvlText w:val=""/>
+      <w:lvlJc w:val="left"/>
+      <w:pPr>
+        <w:tabs>
+          <w:tab w:val="num" w:pos="5760"/>
+        </w:tabs>
+        <w:ind w:left="5760" w:hanging="360"/>
+      </w:pPr>
+      <w:rPr>
+        <w:rFonts w:ascii="Wingdings" w:hAnsi="Wingdings" w:hint="default"/>
+        <w:sz w:val="20"/>
+      </w:rPr>
+    </w:lvl>
+    <w:lvl w:ilvl="8" w:tentative="1">
+      <w:start w:val="1"/>
+      <w:numFmt w:val="bullet"/>
+      <w:lvlText w:val=""/>
+      <w:lvlJc w:val="left"/>
+      <w:pPr>
+        <w:tabs>
+          <w:tab w:val="num" w:pos="6480"/>
+        </w:tabs>
+        <w:ind w:left="6480" w:hanging="360"/>
+      </w:pPr>
+      <w:rPr>
+        <w:rFonts w:ascii="Wingdings" w:hAnsi="Wingdings" w:hint="default"/>
+        <w:sz w:val="20"/>
+      </w:rPr>
+    </w:lvl>
+  </w:abstractNum>
+  <w:abstractNum w:abstractNumId="3" w15:restartNumberingAfterBreak="0">
+    <w:nsid w:val="165747C0"/>
+    <w:multiLevelType w:val="multilevel"/>
+    <w:tmpl w:val="83109938"/>
+    <w:lvl w:ilvl="0">
+      <w:start w:val="1"/>
+      <w:numFmt w:val="decimal"/>
+      <w:lvlText w:val="%1."/>
+      <w:lvlJc w:val="left"/>
+      <w:pPr>
+        <w:tabs>
+          <w:tab w:val="num" w:pos="720"/>
+        </w:tabs>
+        <w:ind w:left="720" w:hanging="360"/>
+      </w:pPr>
+    </w:lvl>
+    <w:lvl w:ilvl="1" w:tentative="1">
+      <w:start w:val="1"/>
+      <w:numFmt w:val="decimal"/>
+      <w:lvlText w:val="%2."/>
+      <w:lvlJc w:val="left"/>
+      <w:pPr>
+        <w:tabs>
+          <w:tab w:val="num" w:pos="1440"/>
+        </w:tabs>
+        <w:ind w:left="1440" w:hanging="360"/>
+      </w:pPr>
+    </w:lvl>
+    <w:lvl w:ilvl="2" w:tentative="1">
+      <w:start w:val="1"/>
+      <w:numFmt w:val="decimal"/>
+      <w:lvlText w:val="%3."/>
+      <w:lvlJc w:val="left"/>
+      <w:pPr>
+        <w:tabs>
+          <w:tab w:val="num" w:pos="2160"/>
+        </w:tabs>
+        <w:ind w:left="2160" w:hanging="360"/>
+      </w:pPr>
+    </w:lvl>
+    <w:lvl w:ilvl="3" w:tentative="1">
+      <w:start w:val="1"/>
+      <w:numFmt w:val="decimal"/>
+      <w:lvlText w:val="%4."/>
+      <w:lvlJc w:val="left"/>
+      <w:pPr>
+        <w:tabs>
+          <w:tab w:val="num" w:pos="2880"/>
+        </w:tabs>
+        <w:ind w:left="2880" w:hanging="360"/>
+      </w:pPr>
+    </w:lvl>
+    <w:lvl w:ilvl="4" w:tentative="1">
+      <w:start w:val="1"/>
+      <w:numFmt w:val="decimal"/>
+      <w:lvlText w:val="%5."/>
+      <w:lvlJc w:val="left"/>
+      <w:pPr>
+        <w:tabs>
+          <w:tab w:val="num" w:pos="3600"/>
+        </w:tabs>
+        <w:ind w:left="3600" w:hanging="360"/>
+      </w:pPr>
+    </w:lvl>
+    <w:lvl w:ilvl="5" w:tentative="1">
+      <w:start w:val="1"/>
+      <w:numFmt w:val="decimal"/>
+      <w:lvlText w:val="%6."/>
+      <w:lvlJc w:val="left"/>
+      <w:pPr>
+        <w:tabs>
+          <w:tab w:val="num" w:pos="4320"/>
+        </w:tabs>
+        <w:ind w:left="4320" w:hanging="360"/>
+      </w:pPr>
+    </w:lvl>
+    <w:lvl w:ilvl="6" w:tentative="1">
+      <w:start w:val="1"/>
+      <w:numFmt w:val="decimal"/>
+      <w:lvlText w:val="%7."/>
+      <w:lvlJc w:val="left"/>
+      <w:pPr>
+        <w:tabs>
+          <w:tab w:val="num" w:pos="5040"/>
+        </w:tabs>
+        <w:ind w:left="5040" w:hanging="360"/>
+      </w:pPr>
+    </w:lvl>
+    <w:lvl w:ilvl="7" w:tentative="1">
+      <w:start w:val="1"/>
+      <w:numFmt w:val="decimal"/>
+      <w:lvlText w:val="%8."/>
+      <w:lvlJc w:val="left"/>
+      <w:pPr>
+        <w:tabs>
+          <w:tab w:val="num" w:pos="5760"/>
+        </w:tabs>
+        <w:ind w:left="5760" w:hanging="360"/>
+      </w:pPr>
+    </w:lvl>
+    <w:lvl w:ilvl="8" w:tentative="1">
+      <w:start w:val="1"/>
+      <w:numFmt w:val="decimal"/>
+      <w:lvlText w:val="%9."/>
+      <w:lvlJc w:val="left"/>
+      <w:pPr>
+        <w:tabs>
+          <w:tab w:val="num" w:pos="6480"/>
+        </w:tabs>
+        <w:ind w:left="6480" w:hanging="360"/>
+      </w:pPr>
+    </w:lvl>
+  </w:abstractNum>
+  <w:abstractNum w:abstractNumId="4" w15:restartNumberingAfterBreak="0">
     <w:nsid w:val="20FD3156"/>
     <w:multiLevelType w:val="multilevel"/>
     <w:tmpl w:val="F7C4A494"/>
@@ -3619,7 +4209,305 @@
       </w:pPr>
     </w:lvl>
   </w:abstractNum>
-  <w:abstractNum w:abstractNumId="1" w15:restartNumberingAfterBreak="0">
+  <w:abstractNum w:abstractNumId="5" w15:restartNumberingAfterBreak="0">
+    <w:nsid w:val="273F529F"/>
+    <w:multiLevelType w:val="multilevel"/>
+    <w:tmpl w:val="D2127AB4"/>
+    <w:lvl w:ilvl="0">
+      <w:start w:val="1"/>
+      <w:numFmt w:val="bullet"/>
+      <w:lvlText w:val=""/>
+      <w:lvlJc w:val="left"/>
+      <w:pPr>
+        <w:tabs>
+          <w:tab w:val="num" w:pos="720"/>
+        </w:tabs>
+        <w:ind w:left="720" w:hanging="360"/>
+      </w:pPr>
+      <w:rPr>
+        <w:rFonts w:ascii="Symbol" w:hAnsi="Symbol" w:hint="default"/>
+        <w:sz w:val="20"/>
+      </w:rPr>
+    </w:lvl>
+    <w:lvl w:ilvl="1">
+      <w:start w:val="1"/>
+      <w:numFmt w:val="bullet"/>
+      <w:lvlText w:val="o"/>
+      <w:lvlJc w:val="left"/>
+      <w:pPr>
+        <w:tabs>
+          <w:tab w:val="num" w:pos="1440"/>
+        </w:tabs>
+        <w:ind w:left="1440" w:hanging="360"/>
+      </w:pPr>
+      <w:rPr>
+        <w:rFonts w:ascii="Courier New" w:hAnsi="Courier New" w:hint="default"/>
+        <w:sz w:val="20"/>
+      </w:rPr>
+    </w:lvl>
+    <w:lvl w:ilvl="2" w:tentative="1">
+      <w:start w:val="1"/>
+      <w:numFmt w:val="bullet"/>
+      <w:lvlText w:val=""/>
+      <w:lvlJc w:val="left"/>
+      <w:pPr>
+        <w:tabs>
+          <w:tab w:val="num" w:pos="2160"/>
+        </w:tabs>
+        <w:ind w:left="2160" w:hanging="360"/>
+      </w:pPr>
+      <w:rPr>
+        <w:rFonts w:ascii="Wingdings" w:hAnsi="Wingdings" w:hint="default"/>
+        <w:sz w:val="20"/>
+      </w:rPr>
+    </w:lvl>
+    <w:lvl w:ilvl="3" w:tentative="1">
+      <w:start w:val="1"/>
+      <w:numFmt w:val="bullet"/>
+      <w:lvlText w:val=""/>
+      <w:lvlJc w:val="left"/>
+      <w:pPr>
+        <w:tabs>
+          <w:tab w:val="num" w:pos="2880"/>
+        </w:tabs>
+        <w:ind w:left="2880" w:hanging="360"/>
+      </w:pPr>
+      <w:rPr>
+        <w:rFonts w:ascii="Wingdings" w:hAnsi="Wingdings" w:hint="default"/>
+        <w:sz w:val="20"/>
+      </w:rPr>
+    </w:lvl>
+    <w:lvl w:ilvl="4" w:tentative="1">
+      <w:start w:val="1"/>
+      <w:numFmt w:val="bullet"/>
+      <w:lvlText w:val=""/>
+      <w:lvlJc w:val="left"/>
+      <w:pPr>
+        <w:tabs>
+          <w:tab w:val="num" w:pos="3600"/>
+        </w:tabs>
+        <w:ind w:left="3600" w:hanging="360"/>
+      </w:pPr>
+      <w:rPr>
+        <w:rFonts w:ascii="Wingdings" w:hAnsi="Wingdings" w:hint="default"/>
+        <w:sz w:val="20"/>
+      </w:rPr>
+    </w:lvl>
+    <w:lvl w:ilvl="5" w:tentative="1">
+      <w:start w:val="1"/>
+      <w:numFmt w:val="bullet"/>
+      <w:lvlText w:val=""/>
+      <w:lvlJc w:val="left"/>
+      <w:pPr>
+        <w:tabs>
+          <w:tab w:val="num" w:pos="4320"/>
+        </w:tabs>
+        <w:ind w:left="4320" w:hanging="360"/>
+      </w:pPr>
+      <w:rPr>
+        <w:rFonts w:ascii="Wingdings" w:hAnsi="Wingdings" w:hint="default"/>
+        <w:sz w:val="20"/>
+      </w:rPr>
+    </w:lvl>
+    <w:lvl w:ilvl="6" w:tentative="1">
+      <w:start w:val="1"/>
+      <w:numFmt w:val="bullet"/>
+      <w:lvlText w:val=""/>
+      <w:lvlJc w:val="left"/>
+      <w:pPr>
+        <w:tabs>
+          <w:tab w:val="num" w:pos="5040"/>
+        </w:tabs>
+        <w:ind w:left="5040" w:hanging="360"/>
+      </w:pPr>
+      <w:rPr>
+        <w:rFonts w:ascii="Wingdings" w:hAnsi="Wingdings" w:hint="default"/>
+        <w:sz w:val="20"/>
+      </w:rPr>
+    </w:lvl>
+    <w:lvl w:ilvl="7" w:tentative="1">
+      <w:start w:val="1"/>
+      <w:numFmt w:val="bullet"/>
+      <w:lvlText w:val=""/>
+      <w:lvlJc w:val="left"/>
+      <w:pPr>
+        <w:tabs>
+          <w:tab w:val="num" w:pos="5760"/>
+        </w:tabs>
+        <w:ind w:left="5760" w:hanging="360"/>
+      </w:pPr>
+      <w:rPr>
+        <w:rFonts w:ascii="Wingdings" w:hAnsi="Wingdings" w:hint="default"/>
+        <w:sz w:val="20"/>
+      </w:rPr>
+    </w:lvl>
+    <w:lvl w:ilvl="8" w:tentative="1">
+      <w:start w:val="1"/>
+      <w:numFmt w:val="bullet"/>
+      <w:lvlText w:val=""/>
+      <w:lvlJc w:val="left"/>
+      <w:pPr>
+        <w:tabs>
+          <w:tab w:val="num" w:pos="6480"/>
+        </w:tabs>
+        <w:ind w:left="6480" w:hanging="360"/>
+      </w:pPr>
+      <w:rPr>
+        <w:rFonts w:ascii="Wingdings" w:hAnsi="Wingdings" w:hint="default"/>
+        <w:sz w:val="20"/>
+      </w:rPr>
+    </w:lvl>
+  </w:abstractNum>
+  <w:abstractNum w:abstractNumId="6" w15:restartNumberingAfterBreak="0">
+    <w:nsid w:val="302C569D"/>
+    <w:multiLevelType w:val="multilevel"/>
+    <w:tmpl w:val="F6C480A6"/>
+    <w:lvl w:ilvl="0">
+      <w:start w:val="1"/>
+      <w:numFmt w:val="bullet"/>
+      <w:lvlText w:val=""/>
+      <w:lvlJc w:val="left"/>
+      <w:pPr>
+        <w:tabs>
+          <w:tab w:val="num" w:pos="720"/>
+        </w:tabs>
+        <w:ind w:left="720" w:hanging="360"/>
+      </w:pPr>
+      <w:rPr>
+        <w:rFonts w:ascii="Symbol" w:hAnsi="Symbol" w:hint="default"/>
+        <w:sz w:val="20"/>
+      </w:rPr>
+    </w:lvl>
+    <w:lvl w:ilvl="1" w:tentative="1">
+      <w:start w:val="1"/>
+      <w:numFmt w:val="bullet"/>
+      <w:lvlText w:val="o"/>
+      <w:lvlJc w:val="left"/>
+      <w:pPr>
+        <w:tabs>
+          <w:tab w:val="num" w:pos="1440"/>
+        </w:tabs>
+        <w:ind w:left="1440" w:hanging="360"/>
+      </w:pPr>
+      <w:rPr>
+        <w:rFonts w:ascii="Courier New" w:hAnsi="Courier New" w:hint="default"/>
+        <w:sz w:val="20"/>
+      </w:rPr>
+    </w:lvl>
+    <w:lvl w:ilvl="2" w:tentative="1">
+      <w:start w:val="1"/>
+      <w:numFmt w:val="bullet"/>
+      <w:lvlText w:val=""/>
+      <w:lvlJc w:val="left"/>
+      <w:pPr>
+        <w:tabs>
+          <w:tab w:val="num" w:pos="2160"/>
+        </w:tabs>
+        <w:ind w:left="2160" w:hanging="360"/>
+      </w:pPr>
+      <w:rPr>
+        <w:rFonts w:ascii="Wingdings" w:hAnsi="Wingdings" w:hint="default"/>
+        <w:sz w:val="20"/>
+      </w:rPr>
+    </w:lvl>
+    <w:lvl w:ilvl="3" w:tentative="1">
+      <w:start w:val="1"/>
+      <w:numFmt w:val="bullet"/>
+      <w:lvlText w:val=""/>
+      <w:lvlJc w:val="left"/>
+      <w:pPr>
+        <w:tabs>
+          <w:tab w:val="num" w:pos="2880"/>
+        </w:tabs>
+        <w:ind w:left="2880" w:hanging="360"/>
+      </w:pPr>
+      <w:rPr>
+        <w:rFonts w:ascii="Wingdings" w:hAnsi="Wingdings" w:hint="default"/>
+        <w:sz w:val="20"/>
+      </w:rPr>
+    </w:lvl>
+    <w:lvl w:ilvl="4" w:tentative="1">
+      <w:start w:val="1"/>
+      <w:numFmt w:val="bullet"/>
+      <w:lvlText w:val=""/>
+      <w:lvlJc w:val="left"/>
+      <w:pPr>
+        <w:tabs>
+          <w:tab w:val="num" w:pos="3600"/>
+        </w:tabs>
+        <w:ind w:left="3600" w:hanging="360"/>
+      </w:pPr>
+      <w:rPr>
+        <w:rFonts w:ascii="Wingdings" w:hAnsi="Wingdings" w:hint="default"/>
+        <w:sz w:val="20"/>
+      </w:rPr>
+    </w:lvl>
+    <w:lvl w:ilvl="5" w:tentative="1">
+      <w:start w:val="1"/>
+      <w:numFmt w:val="bullet"/>
+      <w:lvlText w:val=""/>
+      <w:lvlJc w:val="left"/>
+      <w:pPr>
+        <w:tabs>
+          <w:tab w:val="num" w:pos="4320"/>
+        </w:tabs>
+        <w:ind w:left="4320" w:hanging="360"/>
+      </w:pPr>
+      <w:rPr>
+        <w:rFonts w:ascii="Wingdings" w:hAnsi="Wingdings" w:hint="default"/>
+        <w:sz w:val="20"/>
+      </w:rPr>
+    </w:lvl>
+    <w:lvl w:ilvl="6" w:tentative="1">
+      <w:start w:val="1"/>
+      <w:numFmt w:val="bullet"/>
+      <w:lvlText w:val=""/>
+      <w:lvlJc w:val="left"/>
+      <w:pPr>
+        <w:tabs>
+          <w:tab w:val="num" w:pos="5040"/>
+        </w:tabs>
+        <w:ind w:left="5040" w:hanging="360"/>
+      </w:pPr>
+      <w:rPr>
+        <w:rFonts w:ascii="Wingdings" w:hAnsi="Wingdings" w:hint="default"/>
+        <w:sz w:val="20"/>
+      </w:rPr>
+    </w:lvl>
+    <w:lvl w:ilvl="7" w:tentative="1">
+      <w:start w:val="1"/>
+      <w:numFmt w:val="bullet"/>
+      <w:lvlText w:val=""/>
+      <w:lvlJc w:val="left"/>
+      <w:pPr>
+        <w:tabs>
+          <w:tab w:val="num" w:pos="5760"/>
+        </w:tabs>
+        <w:ind w:left="5760" w:hanging="360"/>
+      </w:pPr>
+      <w:rPr>
+        <w:rFonts w:ascii="Wingdings" w:hAnsi="Wingdings" w:hint="default"/>
+        <w:sz w:val="20"/>
+      </w:rPr>
+    </w:lvl>
+    <w:lvl w:ilvl="8" w:tentative="1">
+      <w:start w:val="1"/>
+      <w:numFmt w:val="bullet"/>
+      <w:lvlText w:val=""/>
+      <w:lvlJc w:val="left"/>
+      <w:pPr>
+        <w:tabs>
+          <w:tab w:val="num" w:pos="6480"/>
+        </w:tabs>
+        <w:ind w:left="6480" w:hanging="360"/>
+      </w:pPr>
+      <w:rPr>
+        <w:rFonts w:ascii="Wingdings" w:hAnsi="Wingdings" w:hint="default"/>
+        <w:sz w:val="20"/>
+      </w:rPr>
+    </w:lvl>
+  </w:abstractNum>
+  <w:abstractNum w:abstractNumId="7" w15:restartNumberingAfterBreak="0">
     <w:nsid w:val="312C2BEE"/>
     <w:multiLevelType w:val="multilevel"/>
     <w:tmpl w:val="030410AA"/>
@@ -3768,7 +4656,7 @@
       </w:rPr>
     </w:lvl>
   </w:abstractNum>
-  <w:abstractNum w:abstractNumId="2" w15:restartNumberingAfterBreak="0">
+  <w:abstractNum w:abstractNumId="8" w15:restartNumberingAfterBreak="0">
     <w:nsid w:val="332E1BD3"/>
     <w:multiLevelType w:val="multilevel"/>
     <w:tmpl w:val="512C56D4"/>
@@ -3885,7 +4773,7 @@
       </w:pPr>
     </w:lvl>
   </w:abstractNum>
-  <w:abstractNum w:abstractNumId="3" w15:restartNumberingAfterBreak="0">
+  <w:abstractNum w:abstractNumId="9" w15:restartNumberingAfterBreak="0">
     <w:nsid w:val="3BBB2881"/>
     <w:multiLevelType w:val="multilevel"/>
     <w:tmpl w:val="525E689A"/>
@@ -4034,7 +4922,7 @@
       </w:rPr>
     </w:lvl>
   </w:abstractNum>
-  <w:abstractNum w:abstractNumId="4" w15:restartNumberingAfterBreak="0">
+  <w:abstractNum w:abstractNumId="10" w15:restartNumberingAfterBreak="0">
     <w:nsid w:val="3BC0633D"/>
     <w:multiLevelType w:val="multilevel"/>
     <w:tmpl w:val="E0C4772C"/>
@@ -4183,7 +5071,156 @@
       </w:rPr>
     </w:lvl>
   </w:abstractNum>
-  <w:abstractNum w:abstractNumId="5" w15:restartNumberingAfterBreak="0">
+  <w:abstractNum w:abstractNumId="11" w15:restartNumberingAfterBreak="0">
+    <w:nsid w:val="3D064C34"/>
+    <w:multiLevelType w:val="multilevel"/>
+    <w:tmpl w:val="6EAC175A"/>
+    <w:lvl w:ilvl="0">
+      <w:start w:val="1"/>
+      <w:numFmt w:val="bullet"/>
+      <w:lvlText w:val=""/>
+      <w:lvlJc w:val="left"/>
+      <w:pPr>
+        <w:tabs>
+          <w:tab w:val="num" w:pos="720"/>
+        </w:tabs>
+        <w:ind w:left="720" w:hanging="360"/>
+      </w:pPr>
+      <w:rPr>
+        <w:rFonts w:ascii="Symbol" w:hAnsi="Symbol" w:hint="default"/>
+        <w:sz w:val="20"/>
+      </w:rPr>
+    </w:lvl>
+    <w:lvl w:ilvl="1" w:tentative="1">
+      <w:start w:val="1"/>
+      <w:numFmt w:val="bullet"/>
+      <w:lvlText w:val="o"/>
+      <w:lvlJc w:val="left"/>
+      <w:pPr>
+        <w:tabs>
+          <w:tab w:val="num" w:pos="1440"/>
+        </w:tabs>
+        <w:ind w:left="1440" w:hanging="360"/>
+      </w:pPr>
+      <w:rPr>
+        <w:rFonts w:ascii="Courier New" w:hAnsi="Courier New" w:hint="default"/>
+        <w:sz w:val="20"/>
+      </w:rPr>
+    </w:lvl>
+    <w:lvl w:ilvl="2" w:tentative="1">
+      <w:start w:val="1"/>
+      <w:numFmt w:val="bullet"/>
+      <w:lvlText w:val=""/>
+      <w:lvlJc w:val="left"/>
+      <w:pPr>
+        <w:tabs>
+          <w:tab w:val="num" w:pos="2160"/>
+        </w:tabs>
+        <w:ind w:left="2160" w:hanging="360"/>
+      </w:pPr>
+      <w:rPr>
+        <w:rFonts w:ascii="Wingdings" w:hAnsi="Wingdings" w:hint="default"/>
+        <w:sz w:val="20"/>
+      </w:rPr>
+    </w:lvl>
+    <w:lvl w:ilvl="3" w:tentative="1">
+      <w:start w:val="1"/>
+      <w:numFmt w:val="bullet"/>
+      <w:lvlText w:val=""/>
+      <w:lvlJc w:val="left"/>
+      <w:pPr>
+        <w:tabs>
+          <w:tab w:val="num" w:pos="2880"/>
+        </w:tabs>
+        <w:ind w:left="2880" w:hanging="360"/>
+      </w:pPr>
+      <w:rPr>
+        <w:rFonts w:ascii="Wingdings" w:hAnsi="Wingdings" w:hint="default"/>
+        <w:sz w:val="20"/>
+      </w:rPr>
+    </w:lvl>
+    <w:lvl w:ilvl="4" w:tentative="1">
+      <w:start w:val="1"/>
+      <w:numFmt w:val="bullet"/>
+      <w:lvlText w:val=""/>
+      <w:lvlJc w:val="left"/>
+      <w:pPr>
+        <w:tabs>
+          <w:tab w:val="num" w:pos="3600"/>
+        </w:tabs>
+        <w:ind w:left="3600" w:hanging="360"/>
+      </w:pPr>
+      <w:rPr>
+        <w:rFonts w:ascii="Wingdings" w:hAnsi="Wingdings" w:hint="default"/>
+        <w:sz w:val="20"/>
+      </w:rPr>
+    </w:lvl>
+    <w:lvl w:ilvl="5" w:tentative="1">
+      <w:start w:val="1"/>
+      <w:numFmt w:val="bullet"/>
+      <w:lvlText w:val=""/>
+      <w:lvlJc w:val="left"/>
+      <w:pPr>
+        <w:tabs>
+          <w:tab w:val="num" w:pos="4320"/>
+        </w:tabs>
+        <w:ind w:left="4320" w:hanging="360"/>
+      </w:pPr>
+      <w:rPr>
+        <w:rFonts w:ascii="Wingdings" w:hAnsi="Wingdings" w:hint="default"/>
+        <w:sz w:val="20"/>
+      </w:rPr>
+    </w:lvl>
+    <w:lvl w:ilvl="6" w:tentative="1">
+      <w:start w:val="1"/>
+      <w:numFmt w:val="bullet"/>
+      <w:lvlText w:val=""/>
+      <w:lvlJc w:val="left"/>
+      <w:pPr>
+        <w:tabs>
+          <w:tab w:val="num" w:pos="5040"/>
+        </w:tabs>
+        <w:ind w:left="5040" w:hanging="360"/>
+      </w:pPr>
+      <w:rPr>
+        <w:rFonts w:ascii="Wingdings" w:hAnsi="Wingdings" w:hint="default"/>
+        <w:sz w:val="20"/>
+      </w:rPr>
+    </w:lvl>
+    <w:lvl w:ilvl="7" w:tentative="1">
+      <w:start w:val="1"/>
+      <w:numFmt w:val="bullet"/>
+      <w:lvlText w:val=""/>
+      <w:lvlJc w:val="left"/>
+      <w:pPr>
+        <w:tabs>
+          <w:tab w:val="num" w:pos="5760"/>
+        </w:tabs>
+        <w:ind w:left="5760" w:hanging="360"/>
+      </w:pPr>
+      <w:rPr>
+        <w:rFonts w:ascii="Wingdings" w:hAnsi="Wingdings" w:hint="default"/>
+        <w:sz w:val="20"/>
+      </w:rPr>
+    </w:lvl>
+    <w:lvl w:ilvl="8" w:tentative="1">
+      <w:start w:val="1"/>
+      <w:numFmt w:val="bullet"/>
+      <w:lvlText w:val=""/>
+      <w:lvlJc w:val="left"/>
+      <w:pPr>
+        <w:tabs>
+          <w:tab w:val="num" w:pos="6480"/>
+        </w:tabs>
+        <w:ind w:left="6480" w:hanging="360"/>
+      </w:pPr>
+      <w:rPr>
+        <w:rFonts w:ascii="Wingdings" w:hAnsi="Wingdings" w:hint="default"/>
+        <w:sz w:val="20"/>
+      </w:rPr>
+    </w:lvl>
+  </w:abstractNum>
+  <w:abstractNum w:abstractNumId="12" w15:restartNumberingAfterBreak="0">
     <w:nsid w:val="45A1062C"/>
     <w:multiLevelType w:val="multilevel"/>
     <w:tmpl w:val="FA6EEE50"/>
@@ -4332,7 +5369,7 @@
       </w:rPr>
     </w:lvl>
   </w:abstractNum>
-  <w:abstractNum w:abstractNumId="6" w15:restartNumberingAfterBreak="0">
+  <w:abstractNum w:abstractNumId="13" w15:restartNumberingAfterBreak="0">
     <w:nsid w:val="4AED1DEC"/>
     <w:multiLevelType w:val="multilevel"/>
     <w:tmpl w:val="2FDC88C0"/>
@@ -4449,7 +5486,241 @@
       </w:pPr>
     </w:lvl>
   </w:abstractNum>
-  <w:abstractNum w:abstractNumId="7" w15:restartNumberingAfterBreak="0">
+  <w:abstractNum w:abstractNumId="14" w15:restartNumberingAfterBreak="0">
+    <w:nsid w:val="4E171834"/>
+    <w:multiLevelType w:val="multilevel"/>
+    <w:tmpl w:val="8E5E3512"/>
+    <w:lvl w:ilvl="0">
+      <w:start w:val="1"/>
+      <w:numFmt w:val="decimal"/>
+      <w:lvlText w:val="%1."/>
+      <w:lvlJc w:val="left"/>
+      <w:pPr>
+        <w:tabs>
+          <w:tab w:val="num" w:pos="720"/>
+        </w:tabs>
+        <w:ind w:left="720" w:hanging="360"/>
+      </w:pPr>
+    </w:lvl>
+    <w:lvl w:ilvl="1">
+      <w:start w:val="1"/>
+      <w:numFmt w:val="bullet"/>
+      <w:lvlText w:val="o"/>
+      <w:lvlJc w:val="left"/>
+      <w:pPr>
+        <w:tabs>
+          <w:tab w:val="num" w:pos="1440"/>
+        </w:tabs>
+        <w:ind w:left="1440" w:hanging="360"/>
+      </w:pPr>
+      <w:rPr>
+        <w:rFonts w:ascii="Courier New" w:hAnsi="Courier New" w:hint="default"/>
+        <w:sz w:val="20"/>
+      </w:rPr>
+    </w:lvl>
+    <w:lvl w:ilvl="2" w:tentative="1">
+      <w:start w:val="1"/>
+      <w:numFmt w:val="decimal"/>
+      <w:lvlText w:val="%3."/>
+      <w:lvlJc w:val="left"/>
+      <w:pPr>
+        <w:tabs>
+          <w:tab w:val="num" w:pos="2160"/>
+        </w:tabs>
+        <w:ind w:left="2160" w:hanging="360"/>
+      </w:pPr>
+    </w:lvl>
+    <w:lvl w:ilvl="3" w:tentative="1">
+      <w:start w:val="1"/>
+      <w:numFmt w:val="decimal"/>
+      <w:lvlText w:val="%4."/>
+      <w:lvlJc w:val="left"/>
+      <w:pPr>
+        <w:tabs>
+          <w:tab w:val="num" w:pos="2880"/>
+        </w:tabs>
+        <w:ind w:left="2880" w:hanging="360"/>
+      </w:pPr>
+    </w:lvl>
+    <w:lvl w:ilvl="4" w:tentative="1">
+      <w:start w:val="1"/>
+      <w:numFmt w:val="decimal"/>
+      <w:lvlText w:val="%5."/>
+      <w:lvlJc w:val="left"/>
+      <w:pPr>
+        <w:tabs>
+          <w:tab w:val="num" w:pos="3600"/>
+        </w:tabs>
+        <w:ind w:left="3600" w:hanging="360"/>
+      </w:pPr>
+    </w:lvl>
+    <w:lvl w:ilvl="5" w:tentative="1">
+      <w:start w:val="1"/>
+      <w:numFmt w:val="decimal"/>
+      <w:lvlText w:val="%6."/>
+      <w:lvlJc w:val="left"/>
+      <w:pPr>
+        <w:tabs>
+          <w:tab w:val="num" w:pos="4320"/>
+        </w:tabs>
+        <w:ind w:left="4320" w:hanging="360"/>
+      </w:pPr>
+    </w:lvl>
+    <w:lvl w:ilvl="6" w:tentative="1">
+      <w:start w:val="1"/>
+      <w:numFmt w:val="decimal"/>
+      <w:lvlText w:val="%7."/>
+      <w:lvlJc w:val="left"/>
+      <w:pPr>
+        <w:tabs>
+          <w:tab w:val="num" w:pos="5040"/>
+        </w:tabs>
+        <w:ind w:left="5040" w:hanging="360"/>
+      </w:pPr>
+    </w:lvl>
+    <w:lvl w:ilvl="7" w:tentative="1">
+      <w:start w:val="1"/>
+      <w:numFmt w:val="decimal"/>
+      <w:lvlText w:val="%8."/>
+      <w:lvlJc w:val="left"/>
+      <w:pPr>
+        <w:tabs>
+          <w:tab w:val="num" w:pos="5760"/>
+        </w:tabs>
+        <w:ind w:left="5760" w:hanging="360"/>
+      </w:pPr>
+    </w:lvl>
+    <w:lvl w:ilvl="8" w:tentative="1">
+      <w:start w:val="1"/>
+      <w:numFmt w:val="decimal"/>
+      <w:lvlText w:val="%9."/>
+      <w:lvlJc w:val="left"/>
+      <w:pPr>
+        <w:tabs>
+          <w:tab w:val="num" w:pos="6480"/>
+        </w:tabs>
+        <w:ind w:left="6480" w:hanging="360"/>
+      </w:pPr>
+    </w:lvl>
+  </w:abstractNum>
+  <w:abstractNum w:abstractNumId="15" w15:restartNumberingAfterBreak="0">
+    <w:nsid w:val="524E4828"/>
+    <w:multiLevelType w:val="multilevel"/>
+    <w:tmpl w:val="E1005BE0"/>
+    <w:lvl w:ilvl="0">
+      <w:start w:val="1"/>
+      <w:numFmt w:val="decimal"/>
+      <w:lvlText w:val="%1."/>
+      <w:lvlJc w:val="left"/>
+      <w:pPr>
+        <w:tabs>
+          <w:tab w:val="num" w:pos="720"/>
+        </w:tabs>
+        <w:ind w:left="720" w:hanging="360"/>
+      </w:pPr>
+    </w:lvl>
+    <w:lvl w:ilvl="1">
+      <w:start w:val="1"/>
+      <w:numFmt w:val="bullet"/>
+      <w:lvlText w:val="o"/>
+      <w:lvlJc w:val="left"/>
+      <w:pPr>
+        <w:tabs>
+          <w:tab w:val="num" w:pos="1440"/>
+        </w:tabs>
+        <w:ind w:left="1440" w:hanging="360"/>
+      </w:pPr>
+      <w:rPr>
+        <w:rFonts w:ascii="Courier New" w:hAnsi="Courier New" w:hint="default"/>
+        <w:sz w:val="20"/>
+      </w:rPr>
+    </w:lvl>
+    <w:lvl w:ilvl="2" w:tentative="1">
+      <w:start w:val="1"/>
+      <w:numFmt w:val="decimal"/>
+      <w:lvlText w:val="%3."/>
+      <w:lvlJc w:val="left"/>
+      <w:pPr>
+        <w:tabs>
+          <w:tab w:val="num" w:pos="2160"/>
+        </w:tabs>
+        <w:ind w:left="2160" w:hanging="360"/>
+      </w:pPr>
+    </w:lvl>
+    <w:lvl w:ilvl="3" w:tentative="1">
+      <w:start w:val="1"/>
+      <w:numFmt w:val="decimal"/>
+      <w:lvlText w:val="%4."/>
+      <w:lvlJc w:val="left"/>
+      <w:pPr>
+        <w:tabs>
+          <w:tab w:val="num" w:pos="2880"/>
+        </w:tabs>
+        <w:ind w:left="2880" w:hanging="360"/>
+      </w:pPr>
+    </w:lvl>
+    <w:lvl w:ilvl="4" w:tentative="1">
+      <w:start w:val="1"/>
+      <w:numFmt w:val="decimal"/>
+      <w:lvlText w:val="%5."/>
+      <w:lvlJc w:val="left"/>
+      <w:pPr>
+        <w:tabs>
+          <w:tab w:val="num" w:pos="3600"/>
+        </w:tabs>
+        <w:ind w:left="3600" w:hanging="360"/>
+      </w:pPr>
+    </w:lvl>
+    <w:lvl w:ilvl="5" w:tentative="1">
+      <w:start w:val="1"/>
+      <w:numFmt w:val="decimal"/>
+      <w:lvlText w:val="%6."/>
+      <w:lvlJc w:val="left"/>
+      <w:pPr>
+        <w:tabs>
+          <w:tab w:val="num" w:pos="4320"/>
+        </w:tabs>
+        <w:ind w:left="4320" w:hanging="360"/>
+      </w:pPr>
+    </w:lvl>
+    <w:lvl w:ilvl="6" w:tentative="1">
+      <w:start w:val="1"/>
+      <w:numFmt w:val="decimal"/>
+      <w:lvlText w:val="%7."/>
+      <w:lvlJc w:val="left"/>
+      <w:pPr>
+        <w:tabs>
+          <w:tab w:val="num" w:pos="5040"/>
+        </w:tabs>
+        <w:ind w:left="5040" w:hanging="360"/>
+      </w:pPr>
+    </w:lvl>
+    <w:lvl w:ilvl="7" w:tentative="1">
+      <w:start w:val="1"/>
+      <w:numFmt w:val="decimal"/>
+      <w:lvlText w:val="%8."/>
+      <w:lvlJc w:val="left"/>
+      <w:pPr>
+        <w:tabs>
+          <w:tab w:val="num" w:pos="5760"/>
+        </w:tabs>
+        <w:ind w:left="5760" w:hanging="360"/>
+      </w:pPr>
+    </w:lvl>
+    <w:lvl w:ilvl="8" w:tentative="1">
+      <w:start w:val="1"/>
+      <w:numFmt w:val="decimal"/>
+      <w:lvlText w:val="%9."/>
+      <w:lvlJc w:val="left"/>
+      <w:pPr>
+        <w:tabs>
+          <w:tab w:val="num" w:pos="6480"/>
+        </w:tabs>
+        <w:ind w:left="6480" w:hanging="360"/>
+      </w:pPr>
+    </w:lvl>
+  </w:abstractNum>
+  <w:abstractNum w:abstractNumId="16" w15:restartNumberingAfterBreak="0">
     <w:nsid w:val="5FD95BAD"/>
     <w:multiLevelType w:val="multilevel"/>
     <w:tmpl w:val="8C287016"/>
@@ -4598,7 +5869,120 @@
       </w:rPr>
     </w:lvl>
   </w:abstractNum>
-  <w:abstractNum w:abstractNumId="8" w15:restartNumberingAfterBreak="0">
+  <w:abstractNum w:abstractNumId="17" w15:restartNumberingAfterBreak="0">
+    <w:nsid w:val="649567C8"/>
+    <w:multiLevelType w:val="multilevel"/>
+    <w:tmpl w:val="5F60524A"/>
+    <w:lvl w:ilvl="0">
+      <w:start w:val="1"/>
+      <w:numFmt w:val="decimal"/>
+      <w:lvlText w:val="%1."/>
+      <w:lvlJc w:val="left"/>
+      <w:pPr>
+        <w:tabs>
+          <w:tab w:val="num" w:pos="720"/>
+        </w:tabs>
+        <w:ind w:left="720" w:hanging="360"/>
+      </w:pPr>
+    </w:lvl>
+    <w:lvl w:ilvl="1" w:tentative="1">
+      <w:start w:val="1"/>
+      <w:numFmt w:val="decimal"/>
+      <w:lvlText w:val="%2."/>
+      <w:lvlJc w:val="left"/>
+      <w:pPr>
+        <w:tabs>
+          <w:tab w:val="num" w:pos="1440"/>
+        </w:tabs>
+        <w:ind w:left="1440" w:hanging="360"/>
+      </w:pPr>
+    </w:lvl>
+    <w:lvl w:ilvl="2" w:tentative="1">
+      <w:start w:val="1"/>
+      <w:numFmt w:val="decimal"/>
+      <w:lvlText w:val="%3."/>
+      <w:lvlJc w:val="left"/>
+      <w:pPr>
+        <w:tabs>
+          <w:tab w:val="num" w:pos="2160"/>
+        </w:tabs>
+        <w:ind w:left="2160" w:hanging="360"/>
+      </w:pPr>
+    </w:lvl>
+    <w:lvl w:ilvl="3" w:tentative="1">
+      <w:start w:val="1"/>
+      <w:numFmt w:val="decimal"/>
+      <w:lvlText w:val="%4."/>
+      <w:lvlJc w:val="left"/>
+      <w:pPr>
+        <w:tabs>
+          <w:tab w:val="num" w:pos="2880"/>
+        </w:tabs>
+        <w:ind w:left="2880" w:hanging="360"/>
+      </w:pPr>
+    </w:lvl>
+    <w:lvl w:ilvl="4" w:tentative="1">
+      <w:start w:val="1"/>
+      <w:numFmt w:val="decimal"/>
+      <w:lvlText w:val="%5."/>
+      <w:lvlJc w:val="left"/>
+      <w:pPr>
+        <w:tabs>
+          <w:tab w:val="num" w:pos="3600"/>
+        </w:tabs>
+        <w:ind w:left="3600" w:hanging="360"/>
+      </w:pPr>
+    </w:lvl>
+    <w:lvl w:ilvl="5" w:tentative="1">
+      <w:start w:val="1"/>
+      <w:numFmt w:val="decimal"/>
+      <w:lvlText w:val="%6."/>
+      <w:lvlJc w:val="left"/>
+      <w:pPr>
+        <w:tabs>
+          <w:tab w:val="num" w:pos="4320"/>
+        </w:tabs>
+        <w:ind w:left="4320" w:hanging="360"/>
+      </w:pPr>
+    </w:lvl>
+    <w:lvl w:ilvl="6" w:tentative="1">
+      <w:start w:val="1"/>
+      <w:numFmt w:val="decimal"/>
+      <w:lvlText w:val="%7."/>
+      <w:lvlJc w:val="left"/>
+      <w:pPr>
+        <w:tabs>
+          <w:tab w:val="num" w:pos="5040"/>
+        </w:tabs>
+        <w:ind w:left="5040" w:hanging="360"/>
+      </w:pPr>
+    </w:lvl>
+    <w:lvl w:ilvl="7" w:tentative="1">
+      <w:start w:val="1"/>
+      <w:numFmt w:val="decimal"/>
+      <w:lvlText w:val="%8."/>
+      <w:lvlJc w:val="left"/>
+      <w:pPr>
+        <w:tabs>
+          <w:tab w:val="num" w:pos="5760"/>
+        </w:tabs>
+        <w:ind w:left="5760" w:hanging="360"/>
+      </w:pPr>
+    </w:lvl>
+    <w:lvl w:ilvl="8" w:tentative="1">
+      <w:start w:val="1"/>
+      <w:numFmt w:val="decimal"/>
+      <w:lvlText w:val="%9."/>
+      <w:lvlJc w:val="left"/>
+      <w:pPr>
+        <w:tabs>
+          <w:tab w:val="num" w:pos="6480"/>
+        </w:tabs>
+        <w:ind w:left="6480" w:hanging="360"/>
+      </w:pPr>
+    </w:lvl>
+  </w:abstractNum>
+  <w:abstractNum w:abstractNumId="18" w15:restartNumberingAfterBreak="0">
     <w:nsid w:val="662C6EC3"/>
     <w:multiLevelType w:val="multilevel"/>
     <w:tmpl w:val="227E90A8"/>
@@ -4711,7 +6095,128 @@
       </w:pPr>
     </w:lvl>
   </w:abstractNum>
-  <w:abstractNum w:abstractNumId="9" w15:restartNumberingAfterBreak="0">
+  <w:abstractNum w:abstractNumId="19" w15:restartNumberingAfterBreak="0">
+    <w:nsid w:val="6A0215D6"/>
+    <w:multiLevelType w:val="multilevel"/>
+    <w:tmpl w:val="E95AC04C"/>
+    <w:lvl w:ilvl="0">
+      <w:start w:val="1"/>
+      <w:numFmt w:val="decimal"/>
+      <w:lvlText w:val="%1."/>
+      <w:lvlJc w:val="left"/>
+      <w:pPr>
+        <w:tabs>
+          <w:tab w:val="num" w:pos="720"/>
+        </w:tabs>
+        <w:ind w:left="720" w:hanging="360"/>
+      </w:pPr>
+    </w:lvl>
+    <w:lvl w:ilvl="1">
+      <w:start w:val="1"/>
+      <w:numFmt w:val="bullet"/>
+      <w:lvlText w:val="o"/>
+      <w:lvlJc w:val="left"/>
+      <w:pPr>
+        <w:tabs>
+          <w:tab w:val="num" w:pos="1440"/>
+        </w:tabs>
+        <w:ind w:left="1440" w:hanging="360"/>
+      </w:pPr>
+      <w:rPr>
+        <w:rFonts w:ascii="Courier New" w:hAnsi="Courier New" w:hint="default"/>
+        <w:sz w:val="20"/>
+      </w:rPr>
+    </w:lvl>
+    <w:lvl w:ilvl="2">
+      <w:start w:val="1"/>
+      <w:numFmt w:val="bullet"/>
+      <w:lvlText w:val=""/>
+      <w:lvlJc w:val="left"/>
+      <w:pPr>
+        <w:tabs>
+          <w:tab w:val="num" w:pos="2160"/>
+        </w:tabs>
+        <w:ind w:left="2160" w:hanging="360"/>
+      </w:pPr>
+      <w:rPr>
+        <w:rFonts w:ascii="Wingdings" w:hAnsi="Wingdings" w:hint="default"/>
+        <w:sz w:val="20"/>
+      </w:rPr>
+    </w:lvl>
+    <w:lvl w:ilvl="3" w:tentative="1">
+      <w:start w:val="1"/>
+      <w:numFmt w:val="decimal"/>
+      <w:lvlText w:val="%4."/>
+      <w:lvlJc w:val="left"/>
+      <w:pPr>
+        <w:tabs>
+          <w:tab w:val="num" w:pos="2880"/>
+        </w:tabs>
+        <w:ind w:left="2880" w:hanging="360"/>
+      </w:pPr>
+    </w:lvl>
+    <w:lvl w:ilvl="4" w:tentative="1">
+      <w:start w:val="1"/>
+      <w:numFmt w:val="decimal"/>
+      <w:lvlText w:val="%5."/>
+      <w:lvlJc w:val="left"/>
+      <w:pPr>
+        <w:tabs>
+          <w:tab w:val="num" w:pos="3600"/>
+        </w:tabs>
+        <w:ind w:left="3600" w:hanging="360"/>
+      </w:pPr>
+    </w:lvl>
+    <w:lvl w:ilvl="5" w:tentative="1">
+      <w:start w:val="1"/>
+      <w:numFmt w:val="decimal"/>
+      <w:lvlText w:val="%6."/>
+      <w:lvlJc w:val="left"/>
+      <w:pPr>
+        <w:tabs>
+          <w:tab w:val="num" w:pos="4320"/>
+        </w:tabs>
+        <w:ind w:left="4320" w:hanging="360"/>
+      </w:pPr>
+    </w:lvl>
+    <w:lvl w:ilvl="6" w:tentative="1">
+      <w:start w:val="1"/>
+      <w:numFmt w:val="decimal"/>
+      <w:lvlText w:val="%7."/>
+      <w:lvlJc w:val="left"/>
+      <w:pPr>
+        <w:tabs>
+          <w:tab w:val="num" w:pos="5040"/>
+        </w:tabs>
+        <w:ind w:left="5040" w:hanging="360"/>
+      </w:pPr>
+    </w:lvl>
+    <w:lvl w:ilvl="7" w:tentative="1">
+      <w:start w:val="1"/>
+      <w:numFmt w:val="decimal"/>
+      <w:lvlText w:val="%8."/>
+      <w:lvlJc w:val="left"/>
+      <w:pPr>
+        <w:tabs>
+          <w:tab w:val="num" w:pos="5760"/>
+        </w:tabs>
+        <w:ind w:left="5760" w:hanging="360"/>
+      </w:pPr>
+    </w:lvl>
+    <w:lvl w:ilvl="8" w:tentative="1">
+      <w:start w:val="1"/>
+      <w:numFmt w:val="decimal"/>
+      <w:lvlText w:val="%9."/>
+      <w:lvlJc w:val="left"/>
+      <w:pPr>
+        <w:tabs>
+          <w:tab w:val="num" w:pos="6480"/>
+        </w:tabs>
+        <w:ind w:left="6480" w:hanging="360"/>
+      </w:pPr>
+    </w:lvl>
+  </w:abstractNum>
+  <w:abstractNum w:abstractNumId="20" w15:restartNumberingAfterBreak="0">
     <w:nsid w:val="6E5A3E2B"/>
     <w:multiLevelType w:val="multilevel"/>
     <w:tmpl w:val="5FCA2D50"/>
@@ -4860,7 +6365,7 @@
       </w:rPr>
     </w:lvl>
   </w:abstractNum>
-  <w:abstractNum w:abstractNumId="10" w15:restartNumberingAfterBreak="0">
+  <w:abstractNum w:abstractNumId="21" w15:restartNumberingAfterBreak="0">
     <w:nsid w:val="72341306"/>
     <w:multiLevelType w:val="multilevel"/>
     <w:tmpl w:val="042699DA"/>
@@ -4981,7 +6486,156 @@
       </w:pPr>
     </w:lvl>
   </w:abstractNum>
-  <w:abstractNum w:abstractNumId="11" w15:restartNumberingAfterBreak="0">
+  <w:abstractNum w:abstractNumId="22" w15:restartNumberingAfterBreak="0">
+    <w:nsid w:val="76BE391B"/>
+    <w:multiLevelType w:val="multilevel"/>
+    <w:tmpl w:val="E4F05572"/>
+    <w:lvl w:ilvl="0">
+      <w:start w:val="1"/>
+      <w:numFmt w:val="bullet"/>
+      <w:lvlText w:val=""/>
+      <w:lvlJc w:val="left"/>
+      <w:pPr>
+        <w:tabs>
+          <w:tab w:val="num" w:pos="720"/>
+        </w:tabs>
+        <w:ind w:left="720" w:hanging="360"/>
+      </w:pPr>
+      <w:rPr>
+        <w:rFonts w:ascii="Symbol" w:hAnsi="Symbol" w:hint="default"/>
+        <w:sz w:val="20"/>
+      </w:rPr>
+    </w:lvl>
+    <w:lvl w:ilvl="1">
+      <w:start w:val="1"/>
+      <w:numFmt w:val="bullet"/>
+      <w:lvlText w:val="o"/>
+      <w:lvlJc w:val="left"/>
+      <w:pPr>
+        <w:tabs>
+          <w:tab w:val="num" w:pos="1440"/>
+        </w:tabs>
+        <w:ind w:left="1440" w:hanging="360"/>
+      </w:pPr>
+      <w:rPr>
+        <w:rFonts w:ascii="Courier New" w:hAnsi="Courier New" w:hint="default"/>
+        <w:sz w:val="20"/>
+      </w:rPr>
+    </w:lvl>
+    <w:lvl w:ilvl="2" w:tentative="1">
+      <w:start w:val="1"/>
+      <w:numFmt w:val="bullet"/>
+      <w:lvlText w:val=""/>
+      <w:lvlJc w:val="left"/>
+      <w:pPr>
+        <w:tabs>
+          <w:tab w:val="num" w:pos="2160"/>
+        </w:tabs>
+        <w:ind w:left="2160" w:hanging="360"/>
+      </w:pPr>
+      <w:rPr>
+        <w:rFonts w:ascii="Wingdings" w:hAnsi="Wingdings" w:hint="default"/>
+        <w:sz w:val="20"/>
+      </w:rPr>
+    </w:lvl>
+    <w:lvl w:ilvl="3" w:tentative="1">
+      <w:start w:val="1"/>
+      <w:numFmt w:val="bullet"/>
+      <w:lvlText w:val=""/>
+      <w:lvlJc w:val="left"/>
+      <w:pPr>
+        <w:tabs>
+          <w:tab w:val="num" w:pos="2880"/>
+        </w:tabs>
+        <w:ind w:left="2880" w:hanging="360"/>
+      </w:pPr>
+      <w:rPr>
+        <w:rFonts w:ascii="Wingdings" w:hAnsi="Wingdings" w:hint="default"/>
+        <w:sz w:val="20"/>
+      </w:rPr>
+    </w:lvl>
+    <w:lvl w:ilvl="4" w:tentative="1">
+      <w:start w:val="1"/>
+      <w:numFmt w:val="bullet"/>
+      <w:lvlText w:val=""/>
+      <w:lvlJc w:val="left"/>
+      <w:pPr>
+        <w:tabs>
+          <w:tab w:val="num" w:pos="3600"/>
+        </w:tabs>
+        <w:ind w:left="3600" w:hanging="360"/>
+      </w:pPr>
+      <w:rPr>
+        <w:rFonts w:ascii="Wingdings" w:hAnsi="Wingdings" w:hint="default"/>
+        <w:sz w:val="20"/>
+      </w:rPr>
+    </w:lvl>
+    <w:lvl w:ilvl="5" w:tentative="1">
+      <w:start w:val="1"/>
+      <w:numFmt w:val="bullet"/>
+      <w:lvlText w:val=""/>
+      <w:lvlJc w:val="left"/>
+      <w:pPr>
+        <w:tabs>
+          <w:tab w:val="num" w:pos="4320"/>
+        </w:tabs>
+        <w:ind w:left="4320" w:hanging="360"/>
+      </w:pPr>
+      <w:rPr>
+        <w:rFonts w:ascii="Wingdings" w:hAnsi="Wingdings" w:hint="default"/>
+        <w:sz w:val="20"/>
+      </w:rPr>
+    </w:lvl>
+    <w:lvl w:ilvl="6" w:tentative="1">
+      <w:start w:val="1"/>
+      <w:numFmt w:val="bullet"/>
+      <w:lvlText w:val=""/>
+      <w:lvlJc w:val="left"/>
+      <w:pPr>
+        <w:tabs>
+          <w:tab w:val="num" w:pos="5040"/>
+        </w:tabs>
+        <w:ind w:left="5040" w:hanging="360"/>
+      </w:pPr>
+      <w:rPr>
+        <w:rFonts w:ascii="Wingdings" w:hAnsi="Wingdings" w:hint="default"/>
+        <w:sz w:val="20"/>
+      </w:rPr>
+    </w:lvl>
+    <w:lvl w:ilvl="7" w:tentative="1">
+      <w:start w:val="1"/>
+      <w:numFmt w:val="bullet"/>
+      <w:lvlText w:val=""/>
+      <w:lvlJc w:val="left"/>
+      <w:pPr>
+        <w:tabs>
+          <w:tab w:val="num" w:pos="5760"/>
+        </w:tabs>
+        <w:ind w:left="5760" w:hanging="360"/>
+      </w:pPr>
+      <w:rPr>
+        <w:rFonts w:ascii="Wingdings" w:hAnsi="Wingdings" w:hint="default"/>
+        <w:sz w:val="20"/>
+      </w:rPr>
+    </w:lvl>
+    <w:lvl w:ilvl="8" w:tentative="1">
+      <w:start w:val="1"/>
+      <w:numFmt w:val="bullet"/>
+      <w:lvlText w:val=""/>
+      <w:lvlJc w:val="left"/>
+      <w:pPr>
+        <w:tabs>
+          <w:tab w:val="num" w:pos="6480"/>
+        </w:tabs>
+        <w:ind w:left="6480" w:hanging="360"/>
+      </w:pPr>
+      <w:rPr>
+        <w:rFonts w:ascii="Wingdings" w:hAnsi="Wingdings" w:hint="default"/>
+        <w:sz w:val="20"/>
+      </w:rPr>
+    </w:lvl>
+  </w:abstractNum>
+  <w:abstractNum w:abstractNumId="23" w15:restartNumberingAfterBreak="0">
     <w:nsid w:val="7A427D7F"/>
     <w:multiLevelType w:val="multilevel"/>
     <w:tmpl w:val="A64E6958"/>
@@ -5131,40 +6785,76 @@
     </w:lvl>
   </w:abstractNum>
   <w:num w:numId="1" w16cid:durableId="895513767">
+    <w:abstractNumId w:val="9"/>
+  </w:num>
+  <w:num w:numId="2" w16cid:durableId="1659571468">
+    <w:abstractNumId w:val="23"/>
+  </w:num>
+  <w:num w:numId="3" w16cid:durableId="453905851">
+    <w:abstractNumId w:val="4"/>
+  </w:num>
+  <w:num w:numId="4" w16cid:durableId="1657951508">
+    <w:abstractNumId w:val="21"/>
+  </w:num>
+  <w:num w:numId="5" w16cid:durableId="987513181">
+    <w:abstractNumId w:val="8"/>
+  </w:num>
+  <w:num w:numId="6" w16cid:durableId="1453328104">
+    <w:abstractNumId w:val="13"/>
+  </w:num>
+  <w:num w:numId="7" w16cid:durableId="1379738388">
+    <w:abstractNumId w:val="7"/>
+  </w:num>
+  <w:num w:numId="8" w16cid:durableId="754286141">
+    <w:abstractNumId w:val="16"/>
+  </w:num>
+  <w:num w:numId="9" w16cid:durableId="748188912">
+    <w:abstractNumId w:val="10"/>
+  </w:num>
+  <w:num w:numId="10" w16cid:durableId="1586642849">
+    <w:abstractNumId w:val="20"/>
+  </w:num>
+  <w:num w:numId="11" w16cid:durableId="167644916">
+    <w:abstractNumId w:val="12"/>
+  </w:num>
+  <w:num w:numId="12" w16cid:durableId="184708888">
+    <w:abstractNumId w:val="18"/>
+  </w:num>
+  <w:num w:numId="13" w16cid:durableId="711927931">
+    <w:abstractNumId w:val="2"/>
+  </w:num>
+  <w:num w:numId="14" w16cid:durableId="2100104081">
+    <w:abstractNumId w:val="6"/>
+  </w:num>
+  <w:num w:numId="15" w16cid:durableId="1025129865">
     <w:abstractNumId w:val="3"/>
   </w:num>
-  <w:num w:numId="2" w16cid:durableId="1659571468">
+  <w:num w:numId="16" w16cid:durableId="1608195052">
+    <w:abstractNumId w:val="19"/>
+  </w:num>
+  <w:num w:numId="17" w16cid:durableId="344212986">
+    <w:abstractNumId w:val="15"/>
+  </w:num>
+  <w:num w:numId="18" w16cid:durableId="794101866">
+    <w:abstractNumId w:val="14"/>
+  </w:num>
+  <w:num w:numId="19" w16cid:durableId="1617978926">
+    <w:abstractNumId w:val="0"/>
+  </w:num>
+  <w:num w:numId="20" w16cid:durableId="779035966">
     <w:abstractNumId w:val="11"/>
   </w:num>
-  <w:num w:numId="3" w16cid:durableId="453905851">
-    <w:abstractNumId w:val="0"/>
-  </w:num>
-  <w:num w:numId="4" w16cid:durableId="1657951508">
-    <w:abstractNumId w:val="10"/>
-  </w:num>
-  <w:num w:numId="5" w16cid:durableId="987513181">
-    <w:abstractNumId w:val="2"/>
-  </w:num>
-  <w:num w:numId="6" w16cid:durableId="1453328104">
-    <w:abstractNumId w:val="6"/>
-  </w:num>
-  <w:num w:numId="7" w16cid:durableId="1379738388">
+  <w:num w:numId="21" w16cid:durableId="758480446">
     <w:abstractNumId w:val="1"/>
   </w:num>
-  <w:num w:numId="8" w16cid:durableId="754286141">
-    <w:abstractNumId w:val="7"/>
+  <w:num w:numId="22" w16cid:durableId="1119109361">
+    <w:abstractNumId w:val="22"/>
   </w:num>
-  <w:num w:numId="9" w16cid:durableId="748188912">
-    <w:abstractNumId w:val="4"/>
-  </w:num>
-  <w:num w:numId="10" w16cid:durableId="1586642849">
-    <w:abstractNumId w:val="9"/>
-  </w:num>
-  <w:num w:numId="11" w16cid:durableId="167644916">
+  <w:num w:numId="23" w16cid:durableId="1941833153">
     <w:abstractNumId w:val="5"/>
   </w:num>
-  <w:num w:numId="12" w16cid:durableId="184708888">
-    <w:abstractNumId w:val="8"/>
+  <w:num w:numId="24" w16cid:durableId="923687826">
+    <w:abstractNumId w:val="17"/>
   </w:num>
 </w:numbering>
 </file>

</xml_diff>